<commit_message>
Danos morais: precedentes citados diretamente, sem referência a acórdão intermediário
Baixa o acórdão da 8ª Câmara Cível (0012313-27.2023.8.16.0014) direto do portal do
TJPR e passa a citar sua ementa completa e o item sobre as funções pedagógica e
inibitória. Remove as expressões "conforme transcrito" e a referência a Cavalieri
tomada de outro acórdão. Atualiza o Word.

Co-Authored-By: Claude Sonnet 5.5 <noreply@anthropic.com>
Claude-Session: https://claude.ai/code/session_01VdvCN9WtNiEirhN2kcoFsu
</commit_message>
<xml_diff>
--- a/peticao-inicial/Petição Inicial - Neusa Corrêa dos Santos x Electrolux, Multiloja e Zurich (nova estética).docx
+++ b/peticao-inicial/Petição Inicial - Neusa Corrêa dos Santos x Electrolux, Multiloja e Zurich (nova estética).docx
@@ -3277,7 +3277,7 @@
           <w:color w:val="1A1A1A"/>
           <w:sz w:val="24"/>
         </w:rPr>
-        <w:t>O Superior Tribunal de Justiça, conforme transcrito em acórdão da 7ª Câmara Cível deste Tribunal, já sintetizou a teoria nos seguintes termos:</w:t>
+        <w:t>O Superior Tribunal de Justiça já definiu a teoria do desvio produtivo nos seguintes termos:</w:t>
       </w:r>
     </w:p>
     <w:p>
@@ -3299,7 +3299,26 @@
           <w:color w:val="333333"/>
           <w:sz w:val="22"/>
         </w:rPr>
-        <w:t>"a teoria do desvio produtivo parte do pressuposto de que haveria uma obrigação imposta aos fornecedores de garantir a otimização e o máximo aproveitamento dos recursos produtivos disponíveis na sociedade, entre eles, o tempo.Assim, para os seus partidários, a referida teoria seria aplicável sempre que o fornecedor buscar se eximir da sua responsabilidade de sanar os infortúnios criados aos consumidores de forma voluntária, tempestiva e efetiva, levando a parte vulnerável da relação a desperdiçar o seu tempo e a desviar de suas atividades normais para solucionar o problema que lhe foi imposto"(EDcl no AgInt no AREsp n. 2.393.261/BA, relatora Ministra Maria Isabel Gallotti, Quarta Turma, julgado em 9/9/2024, DJe de 12/9/2024).</w:t>
+        <w:t>"a teoria do desvio produtivo parte do pressuposto de que haveria uma obrigação imposta aos fornecedores de garantir a otimização e o máximo aproveitamento dos recursos produtivos disponíveis na sociedade, entre eles, o tempo.Assim, para os seus partidários, a referida teoria seria aplicável sempre que o fornecedor buscar se eximir da sua responsabilidade de sanar os infortúnios criados aos consumidores de forma voluntária, tempestiva e efetiva, levando a parte vulnerável da relação a desperdiçar o seu tempo e a desviar de suas atividades normais para solucionar o problema que lhe foi imposto"</w:t>
+      </w:r>
+    </w:p>
+    <w:p>
+      <w:pPr>
+        <w:keepNext w:val="0"/>
+        <w:widowControl/>
+        <w:spacing w:before="0" w:after="240" w:lineRule="auto" w:line="240"/>
+        <w:ind w:left="2268" w:right="0" w:firstLine="0"/>
+        <w:jc w:val="right"/>
+      </w:pPr>
+      <w:r>
+        <w:rPr>
+          <w:rFonts w:ascii="Arial Narrow" w:hAnsi="Arial Narrow" w:eastAsia="Arial Narrow" w:cs="Arial Narrow"/>
+          <w:b w:val="0"/>
+          <w:i w:val="0"/>
+          <w:color w:val="595959"/>
+          <w:sz w:val="20"/>
+        </w:rPr>
+        <w:t>(EDcl no AgInt no AREsp n. 2.393.261/BA, relatora Ministra Maria Isabel Gallotti, Quarta Turma, julgado em 9/9/2024, DJe de 12/9/2024)</w:t>
       </w:r>
     </w:p>
     <w:p>
@@ -3318,7 +3337,7 @@
           <w:color w:val="1A1A1A"/>
           <w:sz w:val="24"/>
         </w:rPr>
-        <w:t>No âmbito deste Tribunal, o Enunciado nº 8.3 das Turmas Recursais do Paraná, tal como transcrito no acórdão da 3ª Turma Recursal acima citado, consolida que "A ineficiência na solução administrativa do problema, com perda do tempo útil do consumidor, caracteriza dano moral indenizável."</w:t>
+        <w:t>No âmbito deste Tribunal, o Enunciado nº 8.3 das Turmas Recursais do Paraná, aplicado pela 3ª Turma Recursal no julgado acima citado (0036980-87.2025.8.16.0182), dispõe que "A ineficiência na solução administrativa do problema, com perda do tempo útil do consumidor, caracteriza dano moral indenizável."</w:t>
       </w:r>
     </w:p>
     <w:p>
@@ -3356,7 +3375,7 @@
           <w:color w:val="1A1A1A"/>
           <w:sz w:val="24"/>
         </w:rPr>
-        <w:t>A 8ª Câmara Cível deste Tribunal, conforme precedente transcrito no mesmo acórdão da 7ª Câmara Cível, fixou em R$ 5.000,00 a indenização devida a consumidor idoso que precisou contatar o fornecedor inúmeras vezes para resolver vício em produto novo:</w:t>
+        <w:t>A 8ª Câmara Cível deste Tribunal fixou em R$ 5.000,00 a indenização devida a consumidor idoso que precisou contatar o fornecedor inúmeras vezes para resolver vício em produto novo, ressaltando, ainda, as funções pedagógica e inibitória da condenação:</w:t>
       </w:r>
     </w:p>
     <w:p>
@@ -3378,7 +3397,7 @@
           <w:color w:val="333333"/>
           <w:sz w:val="22"/>
         </w:rPr>
-        <w:t>MÉRITO – RECURSO DO AUTOR – DANOS MORAIS – OCORRÊNCIA – SITUAÇÃO QUE ULTRAPASSA O MERO DISSABOR COTIDIANO – DEMANDANTE QUE É PESSOA IDOSA, COM OITENTA E UM ANOS – BEM NOVO, ADQUIRIDO PELA INTERNET – VÍCIO DO PRODUTO – AUTOR QUE TEVE QUE ENTRAR COM CONTATO COM A REQUERIDA INÚMERAS VEZES PARA RESOLVER A SITUAÇÃO – COMPROVAÇÃO DE ABALO EXTRAORDINÁRIO À HONRA – VIOLAÇÃO AOS DIREITOS DA PERSONALIDADE – DANO MORAL ARBITRADO EM R$ 5.000,00 (CINCO MIL REAIS) – SENTENÇA REFORMADA, PARA JULGAR PROCEDENTES OS PEDIDOS INICIAIS – REDISTRIBUIÇÃO DA SUCUMBÊNCIA.RECURSO DE APELAÇÃO CONHECIDO E PROVIDO.</w:t>
+        <w:t>APELAÇÃO CÍVEL – AÇÃO DE INDENIZAÇÃO POR DANOS MATERIAIS E MORAIS – FALHA NA PRESTAÇÃO DO SERVIÇO DE VENDA DE MÁQUINA DE LAVAR LOUÇAS – SENTENÇA DE PARCIAL PROCEDÊNCIA. (...) MÉRITO – RECURSO DO AUTOR – DANOS MORAIS – OCORRÊNCIA – SITUAÇÃO QUE ULTRAPASSA O MERO DISSABOR COTIDIANO – DEMANDANTE QUE É PESSOA IDOSA, COM OITENTA E UM ANOS – BEM NOVO, ADQUIRIDO PELA INTERNET – VÍCIO DO PRODUTO – AUTOR QUE TEVE QUE ENTRAR COM CONTATO COM A REQUERIDA INÚMERAS VEZES PARA RESOLVER A SITUAÇÃO – COMPROVAÇÃO DE ABALO EXTRAORDINÁRIO À HONRA – VIOLAÇÃO AOS DIREITOS DA PERSONALIDADE – DANO MORAL ARBITRADO EM R$ 5.000,00 (CINCO MIL REAIS) – SENTENÇA REFORMADA, PARA JULGAR PROCEDENTES OS PEDIDOS INICIAIS – REDISTRIBUIÇÃO DA SUCUMBÊNCIA.RECURSO DE APELAÇÃO CONHECIDO E PROVIDO. (...) 2. Considerando-se as peculiaridades do caso concreto, as funções pedagógica e inibitória da reprimenda, o caráter compensatório pela aflição e intranquilidade causadas pelo ato ilícito, a gravidade e a duração da lesão, a possibilidade de quem deve reparar o dano e as condições econômicas e sociais do ofendido, necessário o arbitramento da indenização referente aos danos morais, em R$ 5.000,00 (cinco mil reais), quantia que se mostra razoável e proporcional.</w:t>
       </w:r>
     </w:p>
     <w:p>
@@ -3517,7 +3536,7 @@
           <w:color w:val="1A1A1A"/>
           <w:sz w:val="24"/>
         </w:rPr>
-        <w:t>No mesmo acórdão, o Tribunal invocou a lição de Sergio Cavalieri Filho, segundo a qual "o juiz, ao valorar o dano moral, deve arbitrar uma quantia que, de acordo com o seu prudente arbítrio, seja compatível com a reprovabilidade da conduta ilícita, a intensidade e duração do sofrimento experimentado pela vítima, a capacidade econômica do causador do dano, as condições sociais do ofendido, e outras circunstâncias mais que se fizerem presentes", e destacou que, sendo as rés "pessoas jurídicas de elevado poder econômico", o valor de R$ 5.000,00 era "suficiente a proporcionar consolo às vítimas e cumprir a sua função pedagógica".</w:t>
+        <w:t>No mesmo julgado, a 9ª Câmara Cível levou em conta que as rés eram "pessoas jurídicas de elevado poder econômico" e concluiu que o valor de R$ 5.000,00 era "suficiente a proporcionar consolo às vítimas e cumprir a sua função pedagógica".</w:t>
       </w:r>
     </w:p>
     <w:p>

</xml_diff>

<commit_message>
Petição: referência do tribunal colada à ementa e sem hifenização automática
A linha de referência (órgão, processo, relator, data) passa a ficar no mesmo
parágrafo da ementa, na mesma letra. Todo parágrafo do Word recebe a marcação
que impede hifenização automática.

Co-Authored-By: Claude Sonnet 5.5 <noreply@anthropic.com>
Claude-Session: https://claude.ai/code/session_01VdvCN9WtNiEirhN2kcoFsu
</commit_message>
<xml_diff>
--- a/peticao-inicial/Petição Inicial - Neusa Corrêa dos Santos x Electrolux, Multiloja e Zurich (nova estética).docx
+++ b/peticao-inicial/Petição Inicial - Neusa Corrêa dos Santos x Electrolux, Multiloja e Zurich (nova estética).docx
@@ -6,6 +6,7 @@
       <w:pPr>
         <w:keepNext w:val="0"/>
         <w:widowControl/>
+        <w:suppressAutoHyphens/>
         <w:spacing w:before="0" w:after="240" w:lineRule="auto" w:line="331"/>
         <w:ind w:left="0" w:right="0" w:firstLine="0"/>
         <w:jc w:val="both"/>
@@ -26,6 +27,7 @@
         <w:keepNext w:val="0"/>
         <w:widowControl/>
         <w:shd w:val="clear" w:color="auto" w:fill="1F3864"/>
+        <w:suppressAutoHyphens/>
         <w:spacing w:before="0" w:after="320" w:lineRule="auto" w:line="264"/>
         <w:ind w:left="4819" w:right="0" w:firstLine="0"/>
         <w:jc w:val="center"/>
@@ -48,6 +50,7 @@
         <w:pBdr>
           <w:left w:val="single" w:sz="12" w:space="8" w:color="B4C0D3"/>
         </w:pBdr>
+        <w:suppressAutoHyphens/>
         <w:spacing w:before="0" w:after="120" w:lineRule="auto" w:line="331"/>
         <w:ind w:left="567" w:right="0" w:firstLine="0"/>
         <w:jc w:val="both"/>
@@ -77,6 +80,7 @@
       <w:pPr>
         <w:keepNext w:val="0"/>
         <w:widowControl/>
+        <w:suppressAutoHyphens/>
         <w:spacing w:before="0" w:after="120" w:lineRule="auto" w:line="331"/>
         <w:ind w:left="0" w:right="0" w:firstLine="1417"/>
         <w:jc w:val="both"/>
@@ -99,6 +103,7 @@
         <w:pBdr>
           <w:left w:val="single" w:sz="12" w:space="8" w:color="B4C0D3"/>
         </w:pBdr>
+        <w:suppressAutoHyphens/>
         <w:spacing w:before="0" w:after="120" w:lineRule="auto" w:line="331"/>
         <w:ind w:left="567" w:right="0" w:firstLine="0"/>
         <w:jc w:val="both"/>
@@ -131,6 +136,7 @@
         <w:pBdr>
           <w:left w:val="single" w:sz="12" w:space="8" w:color="B4C0D3"/>
         </w:pBdr>
+        <w:suppressAutoHyphens/>
         <w:spacing w:before="0" w:after="120" w:lineRule="auto" w:line="331"/>
         <w:ind w:left="567" w:right="0" w:firstLine="0"/>
         <w:jc w:val="both"/>
@@ -160,6 +166,7 @@
       <w:pPr>
         <w:keepNext w:val="0"/>
         <w:widowControl/>
+        <w:suppressAutoHyphens/>
         <w:spacing w:before="0" w:after="0" w:lineRule="auto" w:line="331"/>
         <w:ind w:left="0" w:right="0" w:firstLine="1417"/>
         <w:jc w:val="both"/>
@@ -183,6 +190,7 @@
           <w:top w:val="single" w:sz="12" w:space="5" w:color="1F3864"/>
           <w:bottom w:val="single" w:sz="12" w:space="5" w:color="1F3864"/>
         </w:pBdr>
+        <w:suppressAutoHyphens/>
         <w:spacing w:before="280" w:after="280" w:lineRule="auto" w:line="276"/>
         <w:ind w:left="454" w:right="454" w:firstLine="0"/>
         <w:jc w:val="center"/>
@@ -202,6 +210,7 @@
       <w:pPr>
         <w:keepNext w:val="0"/>
         <w:widowControl/>
+        <w:suppressAutoHyphens/>
         <w:spacing w:before="0" w:after="120" w:lineRule="auto" w:line="331"/>
         <w:ind w:left="0" w:right="0" w:firstLine="1417"/>
         <w:jc w:val="both"/>
@@ -224,6 +233,7 @@
         <w:pBdr>
           <w:left w:val="single" w:sz="12" w:space="8" w:color="B4C0D3"/>
         </w:pBdr>
+        <w:suppressAutoHyphens/>
         <w:spacing w:before="0" w:after="120" w:lineRule="auto" w:line="331"/>
         <w:ind w:left="567" w:right="0" w:firstLine="0"/>
         <w:jc w:val="both"/>
@@ -256,6 +266,7 @@
         <w:pBdr>
           <w:left w:val="single" w:sz="12" w:space="8" w:color="B4C0D3"/>
         </w:pBdr>
+        <w:suppressAutoHyphens/>
         <w:spacing w:before="0" w:after="120" w:lineRule="auto" w:line="331"/>
         <w:ind w:left="567" w:right="0" w:firstLine="0"/>
         <w:jc w:val="both"/>
@@ -288,6 +299,7 @@
         <w:pBdr>
           <w:left w:val="single" w:sz="12" w:space="8" w:color="B4C0D3"/>
         </w:pBdr>
+        <w:suppressAutoHyphens/>
         <w:spacing w:before="0" w:after="120" w:lineRule="auto" w:line="331"/>
         <w:ind w:left="567" w:right="0" w:firstLine="0"/>
         <w:jc w:val="both"/>
@@ -317,6 +329,7 @@
       <w:pPr>
         <w:keepNext w:val="0"/>
         <w:widowControl/>
+        <w:suppressAutoHyphens/>
         <w:spacing w:before="40" w:after="0" w:lineRule="auto" w:line="331"/>
         <w:ind w:left="0" w:right="0" w:firstLine="1417"/>
         <w:jc w:val="both"/>
@@ -362,6 +375,7 @@
           <w:p>
             <w:pPr>
               <w:pageBreakBefore/>
+              <w:suppressAutoHyphens/>
               <w:spacing w:before="70" w:after="70" w:line="252" w:lineRule="auto"/>
               <w:jc w:val="center"/>
             </w:pPr>
@@ -392,6 +406,7 @@
           </w:tcPr>
           <w:p>
             <w:pPr>
+              <w:suppressAutoHyphens/>
               <w:spacing w:before="70" w:after="70" w:line="252" w:lineRule="auto"/>
               <w:jc w:val="left"/>
             </w:pPr>
@@ -419,6 +434,7 @@
           </w:tcPr>
           <w:p>
             <w:pPr>
+              <w:suppressAutoHyphens/>
               <w:spacing w:before="70" w:after="70" w:line="252" w:lineRule="auto"/>
               <w:jc w:val="left"/>
             </w:pPr>
@@ -445,6 +461,7 @@
           </w:tcPr>
           <w:p>
             <w:pPr>
+              <w:suppressAutoHyphens/>
               <w:spacing w:before="70" w:after="70" w:line="252" w:lineRule="auto"/>
               <w:jc w:val="left"/>
             </w:pPr>
@@ -472,6 +489,7 @@
           </w:tcPr>
           <w:p>
             <w:pPr>
+              <w:suppressAutoHyphens/>
               <w:spacing w:before="70" w:after="70" w:line="252" w:lineRule="auto"/>
               <w:jc w:val="left"/>
             </w:pPr>
@@ -498,6 +516,7 @@
           </w:tcPr>
           <w:p>
             <w:pPr>
+              <w:suppressAutoHyphens/>
               <w:spacing w:before="70" w:after="70" w:line="252" w:lineRule="auto"/>
               <w:jc w:val="left"/>
             </w:pPr>
@@ -525,6 +544,7 @@
           </w:tcPr>
           <w:p>
             <w:pPr>
+              <w:suppressAutoHyphens/>
               <w:spacing w:before="70" w:after="70" w:line="252" w:lineRule="auto"/>
               <w:jc w:val="left"/>
             </w:pPr>
@@ -551,6 +571,7 @@
           </w:tcPr>
           <w:p>
             <w:pPr>
+              <w:suppressAutoHyphens/>
               <w:spacing w:before="70" w:after="70" w:line="252" w:lineRule="auto"/>
               <w:jc w:val="left"/>
             </w:pPr>
@@ -578,6 +599,7 @@
           </w:tcPr>
           <w:p>
             <w:pPr>
+              <w:suppressAutoHyphens/>
               <w:spacing w:before="70" w:after="70" w:line="252" w:lineRule="auto"/>
               <w:jc w:val="left"/>
             </w:pPr>
@@ -604,6 +626,7 @@
           </w:tcPr>
           <w:p>
             <w:pPr>
+              <w:suppressAutoHyphens/>
               <w:spacing w:before="70" w:after="70" w:line="252" w:lineRule="auto"/>
               <w:jc w:val="left"/>
             </w:pPr>
@@ -631,6 +654,7 @@
           </w:tcPr>
           <w:p>
             <w:pPr>
+              <w:suppressAutoHyphens/>
               <w:spacing w:before="70" w:after="70" w:line="252" w:lineRule="auto"/>
               <w:jc w:val="left"/>
             </w:pPr>
@@ -657,6 +681,7 @@
           </w:tcPr>
           <w:p>
             <w:pPr>
+              <w:suppressAutoHyphens/>
               <w:spacing w:before="70" w:after="70" w:line="252" w:lineRule="auto"/>
               <w:jc w:val="left"/>
             </w:pPr>
@@ -684,6 +709,7 @@
           </w:tcPr>
           <w:p>
             <w:pPr>
+              <w:suppressAutoHyphens/>
               <w:spacing w:before="70" w:after="70" w:line="252" w:lineRule="auto"/>
               <w:jc w:val="left"/>
             </w:pPr>
@@ -711,6 +737,7 @@
           </w:tcPr>
           <w:p>
             <w:pPr>
+              <w:suppressAutoHyphens/>
               <w:spacing w:before="70" w:after="70" w:line="252" w:lineRule="auto"/>
               <w:jc w:val="center"/>
             </w:pPr>
@@ -741,6 +768,7 @@
           </w:tcPr>
           <w:p>
             <w:pPr>
+              <w:suppressAutoHyphens/>
               <w:spacing w:before="70" w:after="70" w:line="252" w:lineRule="auto"/>
               <w:jc w:val="left"/>
             </w:pPr>
@@ -768,6 +796,7 @@
           </w:tcPr>
           <w:p>
             <w:pPr>
+              <w:suppressAutoHyphens/>
               <w:spacing w:before="70" w:after="70" w:line="252" w:lineRule="auto"/>
               <w:jc w:val="left"/>
             </w:pPr>
@@ -794,6 +823,7 @@
           </w:tcPr>
           <w:p>
             <w:pPr>
+              <w:suppressAutoHyphens/>
               <w:spacing w:before="70" w:after="70" w:line="252" w:lineRule="auto"/>
               <w:jc w:val="left"/>
             </w:pPr>
@@ -821,6 +851,7 @@
           </w:tcPr>
           <w:p>
             <w:pPr>
+              <w:suppressAutoHyphens/>
               <w:spacing w:before="70" w:after="70" w:line="252" w:lineRule="auto"/>
               <w:jc w:val="left"/>
             </w:pPr>
@@ -847,6 +878,7 @@
           </w:tcPr>
           <w:p>
             <w:pPr>
+              <w:suppressAutoHyphens/>
               <w:spacing w:before="70" w:after="70" w:line="252" w:lineRule="auto"/>
               <w:jc w:val="left"/>
             </w:pPr>
@@ -874,6 +906,7 @@
           </w:tcPr>
           <w:p>
             <w:pPr>
+              <w:suppressAutoHyphens/>
               <w:spacing w:before="70" w:after="70" w:line="252" w:lineRule="auto"/>
               <w:jc w:val="left"/>
             </w:pPr>
@@ -900,6 +933,7 @@
           </w:tcPr>
           <w:p>
             <w:pPr>
+              <w:suppressAutoHyphens/>
               <w:spacing w:before="70" w:after="70" w:line="252" w:lineRule="auto"/>
               <w:jc w:val="left"/>
             </w:pPr>
@@ -927,6 +961,7 @@
           </w:tcPr>
           <w:p>
             <w:pPr>
+              <w:suppressAutoHyphens/>
               <w:spacing w:before="70" w:after="70" w:line="252" w:lineRule="auto"/>
               <w:jc w:val="left"/>
             </w:pPr>
@@ -953,6 +988,7 @@
           </w:tcPr>
           <w:p>
             <w:pPr>
+              <w:suppressAutoHyphens/>
               <w:spacing w:before="70" w:after="70" w:line="252" w:lineRule="auto"/>
               <w:jc w:val="left"/>
             </w:pPr>
@@ -980,6 +1016,7 @@
           </w:tcPr>
           <w:p>
             <w:pPr>
+              <w:suppressAutoHyphens/>
               <w:spacing w:before="70" w:after="70" w:line="252" w:lineRule="auto"/>
               <w:jc w:val="left"/>
             </w:pPr>
@@ -1006,6 +1043,7 @@
           </w:tcPr>
           <w:p>
             <w:pPr>
+              <w:suppressAutoHyphens/>
               <w:spacing w:before="70" w:after="70" w:line="252" w:lineRule="auto"/>
               <w:jc w:val="left"/>
             </w:pPr>
@@ -1033,6 +1071,7 @@
           </w:tcPr>
           <w:p>
             <w:pPr>
+              <w:suppressAutoHyphens/>
               <w:spacing w:before="70" w:after="70" w:line="252" w:lineRule="auto"/>
               <w:jc w:val="left"/>
             </w:pPr>
@@ -1059,6 +1098,7 @@
           </w:tcPr>
           <w:p>
             <w:pPr>
+              <w:suppressAutoHyphens/>
               <w:spacing w:before="70" w:after="70" w:line="252" w:lineRule="auto"/>
               <w:jc w:val="left"/>
             </w:pPr>
@@ -1086,6 +1126,7 @@
           </w:tcPr>
           <w:p>
             <w:pPr>
+              <w:suppressAutoHyphens/>
               <w:spacing w:before="70" w:after="70" w:line="252" w:lineRule="auto"/>
               <w:jc w:val="left"/>
             </w:pPr>
@@ -1112,6 +1153,7 @@
           </w:tcPr>
           <w:p>
             <w:pPr>
+              <w:suppressAutoHyphens/>
               <w:spacing w:before="70" w:after="70" w:line="252" w:lineRule="auto"/>
               <w:jc w:val="left"/>
             </w:pPr>
@@ -1139,6 +1181,7 @@
           </w:tcPr>
           <w:p>
             <w:pPr>
+              <w:suppressAutoHyphens/>
               <w:spacing w:before="70" w:after="70" w:line="252" w:lineRule="auto"/>
               <w:jc w:val="left"/>
             </w:pPr>
@@ -1165,6 +1208,7 @@
           </w:tcPr>
           <w:p>
             <w:pPr>
+              <w:suppressAutoHyphens/>
               <w:spacing w:before="70" w:after="70" w:line="252" w:lineRule="auto"/>
               <w:jc w:val="left"/>
             </w:pPr>
@@ -1192,6 +1236,7 @@
           </w:tcPr>
           <w:p>
             <w:pPr>
+              <w:suppressAutoHyphens/>
               <w:spacing w:before="70" w:after="70" w:line="252" w:lineRule="auto"/>
               <w:jc w:val="left"/>
             </w:pPr>
@@ -1218,6 +1263,7 @@
         <w:pBdr>
           <w:bottom w:val="single" w:sz="8" w:space="3" w:color="1F3864"/>
         </w:pBdr>
+        <w:suppressAutoHyphens/>
         <w:spacing w:before="0" w:after="120" w:lineRule="auto" w:line="276"/>
         <w:ind w:left="0" w:right="0" w:firstLine="0"/>
         <w:jc w:val="left"/>
@@ -1244,6 +1290,7 @@
           <w:right w:val="single" w:sz="4" w:space="6" w:color="C9D3E3"/>
         </w:pBdr>
         <w:shd w:val="clear" w:color="auto" w:fill="EEF2F7"/>
+        <w:suppressAutoHyphens/>
         <w:spacing w:before="0" w:after="200" w:lineRule="auto" w:line="276"/>
         <w:ind w:left="198" w:right="113" w:firstLine="0"/>
         <w:jc w:val="both"/>
@@ -1273,6 +1320,7 @@
       <w:pPr>
         <w:keepNext w:val="0"/>
         <w:widowControl/>
+        <w:suppressAutoHyphens/>
         <w:spacing w:before="0" w:after="120" w:lineRule="auto" w:line="312"/>
         <w:ind w:left="0" w:right="0" w:firstLine="1417"/>
         <w:jc w:val="both"/>
@@ -1292,6 +1340,7 @@
       <w:pPr>
         <w:keepNext w:val="0"/>
         <w:widowControl/>
+        <w:suppressAutoHyphens/>
         <w:spacing w:before="0" w:after="120" w:lineRule="auto" w:line="312"/>
         <w:ind w:left="0" w:right="0" w:firstLine="1417"/>
         <w:jc w:val="both"/>
@@ -1314,6 +1363,7 @@
         <w:pBdr>
           <w:bottom w:val="single" w:sz="8" w:space="3" w:color="1F3864"/>
         </w:pBdr>
+        <w:suppressAutoHyphens/>
         <w:spacing w:before="280" w:after="120" w:lineRule="auto" w:line="276"/>
         <w:ind w:left="0" w:right="0" w:firstLine="0"/>
         <w:jc w:val="left"/>
@@ -1340,6 +1390,7 @@
           <w:right w:val="single" w:sz="4" w:space="6" w:color="C9D3E3"/>
         </w:pBdr>
         <w:shd w:val="clear" w:color="auto" w:fill="EEF2F7"/>
+        <w:suppressAutoHyphens/>
         <w:spacing w:before="0" w:after="200" w:lineRule="auto" w:line="276"/>
         <w:ind w:left="198" w:right="113" w:firstLine="0"/>
         <w:jc w:val="both"/>
@@ -1369,6 +1420,7 @@
       <w:pPr>
         <w:keepNext w:val="0"/>
         <w:widowControl/>
+        <w:suppressAutoHyphens/>
         <w:spacing w:before="0" w:after="120" w:lineRule="auto" w:line="312"/>
         <w:ind w:left="0" w:right="0" w:firstLine="1417"/>
         <w:jc w:val="both"/>
@@ -1388,6 +1440,7 @@
       <w:pPr>
         <w:keepNext w:val="0"/>
         <w:widowControl/>
+        <w:suppressAutoHyphens/>
         <w:spacing w:before="0" w:after="120" w:lineRule="auto" w:line="312"/>
         <w:ind w:left="0" w:right="0" w:firstLine="1417"/>
         <w:jc w:val="both"/>
@@ -1407,6 +1460,7 @@
       <w:pPr>
         <w:keepNext w:val="0"/>
         <w:widowControl/>
+        <w:suppressAutoHyphens/>
         <w:spacing w:before="0" w:after="120" w:lineRule="auto" w:line="312"/>
         <w:ind w:left="0" w:right="0" w:firstLine="1417"/>
         <w:jc w:val="both"/>
@@ -1426,6 +1480,7 @@
       <w:pPr>
         <w:keepNext w:val="0"/>
         <w:widowControl/>
+        <w:suppressAutoHyphens/>
         <w:spacing w:before="0" w:after="120" w:lineRule="auto" w:line="312"/>
         <w:ind w:left="0" w:right="0" w:firstLine="1417"/>
         <w:jc w:val="both"/>
@@ -1445,6 +1500,7 @@
       <w:pPr>
         <w:keepNext w:val="0"/>
         <w:widowControl/>
+        <w:suppressAutoHyphens/>
         <w:spacing w:before="0" w:after="120" w:lineRule="auto" w:line="312"/>
         <w:ind w:left="0" w:right="0" w:firstLine="1417"/>
         <w:jc w:val="both"/>
@@ -1464,6 +1520,7 @@
       <w:pPr>
         <w:keepNext w:val="0"/>
         <w:widowControl/>
+        <w:suppressAutoHyphens/>
         <w:spacing w:before="0" w:after="120" w:lineRule="auto" w:line="312"/>
         <w:ind w:left="0" w:right="0" w:firstLine="1417"/>
         <w:jc w:val="both"/>
@@ -1483,6 +1540,7 @@
       <w:pPr>
         <w:keepNext w:val="0"/>
         <w:widowControl/>
+        <w:suppressAutoHyphens/>
         <w:spacing w:before="0" w:after="120" w:lineRule="auto" w:line="312"/>
         <w:ind w:left="0" w:right="0" w:firstLine="1417"/>
         <w:jc w:val="both"/>
@@ -1502,6 +1560,7 @@
       <w:pPr>
         <w:keepNext w:val="0"/>
         <w:widowControl/>
+        <w:suppressAutoHyphens/>
         <w:spacing w:before="0" w:after="120" w:lineRule="auto" w:line="312"/>
         <w:ind w:left="0" w:right="0" w:firstLine="1417"/>
         <w:jc w:val="both"/>
@@ -1524,6 +1583,7 @@
         <w:pBdr>
           <w:bottom w:val="single" w:sz="8" w:space="3" w:color="1F3864"/>
         </w:pBdr>
+        <w:suppressAutoHyphens/>
         <w:spacing w:before="280" w:after="120" w:lineRule="auto" w:line="276"/>
         <w:ind w:left="0" w:right="0" w:firstLine="0"/>
         <w:jc w:val="left"/>
@@ -1550,6 +1610,7 @@
           <w:right w:val="single" w:sz="4" w:space="6" w:color="C9D3E3"/>
         </w:pBdr>
         <w:shd w:val="clear" w:color="auto" w:fill="EEF2F7"/>
+        <w:suppressAutoHyphens/>
         <w:spacing w:before="0" w:after="200" w:lineRule="auto" w:line="276"/>
         <w:ind w:left="198" w:right="113" w:firstLine="0"/>
         <w:jc w:val="both"/>
@@ -1579,6 +1640,7 @@
       <w:pPr>
         <w:keepNext w:val="0"/>
         <w:widowControl/>
+        <w:suppressAutoHyphens/>
         <w:spacing w:before="0" w:after="120" w:lineRule="auto" w:line="312"/>
         <w:ind w:left="0" w:right="0" w:firstLine="1417"/>
         <w:jc w:val="both"/>
@@ -1598,6 +1660,7 @@
       <w:pPr>
         <w:keepNext w:val="0"/>
         <w:widowControl/>
+        <w:suppressAutoHyphens/>
         <w:spacing w:before="0" w:after="120" w:lineRule="auto" w:line="312"/>
         <w:ind w:left="0" w:right="0" w:firstLine="1417"/>
         <w:jc w:val="both"/>
@@ -1617,6 +1680,7 @@
       <w:pPr>
         <w:keepNext w:val="0"/>
         <w:widowControl/>
+        <w:suppressAutoHyphens/>
         <w:spacing w:before="0" w:after="120" w:lineRule="auto" w:line="312"/>
         <w:ind w:left="0" w:right="0" w:firstLine="1417"/>
         <w:jc w:val="both"/>
@@ -1636,6 +1700,7 @@
       <w:pPr>
         <w:keepNext w:val="0"/>
         <w:widowControl/>
+        <w:suppressAutoHyphens/>
         <w:spacing w:before="0" w:after="120" w:lineRule="auto" w:line="312"/>
         <w:ind w:left="0" w:right="0" w:firstLine="1417"/>
         <w:jc w:val="both"/>
@@ -1658,6 +1723,7 @@
         <w:pBdr>
           <w:left w:val="single" w:sz="12" w:space="8" w:color="B4C0D3"/>
         </w:pBdr>
+        <w:suppressAutoHyphens/>
         <w:spacing w:before="0" w:after="120" w:lineRule="auto" w:line="252"/>
         <w:ind w:left="2268" w:right="0" w:firstLine="0"/>
         <w:jc w:val="both"/>
@@ -1680,7 +1746,8 @@
         <w:pBdr>
           <w:left w:val="single" w:sz="12" w:space="8" w:color="B4C0D3"/>
         </w:pBdr>
-        <w:spacing w:before="0" w:after="120" w:lineRule="auto" w:line="252"/>
+        <w:suppressAutoHyphens/>
+        <w:spacing w:before="0" w:after="240" w:lineRule="auto" w:line="252"/>
         <w:ind w:left="2268" w:right="0" w:firstLine="0"/>
         <w:jc w:val="both"/>
       </w:pPr>
@@ -1699,6 +1766,7 @@
       <w:pPr>
         <w:keepNext w:val="0"/>
         <w:widowControl/>
+        <w:suppressAutoHyphens/>
         <w:spacing w:before="0" w:after="120" w:lineRule="auto" w:line="312"/>
         <w:ind w:left="0" w:right="0" w:firstLine="1417"/>
         <w:jc w:val="both"/>
@@ -1718,6 +1786,7 @@
       <w:pPr>
         <w:keepNext w:val="0"/>
         <w:widowControl/>
+        <w:suppressAutoHyphens/>
         <w:spacing w:before="0" w:after="120" w:lineRule="auto" w:line="312"/>
         <w:ind w:left="0" w:right="0" w:firstLine="1417"/>
         <w:jc w:val="both"/>
@@ -1737,6 +1806,7 @@
       <w:pPr>
         <w:keepNext w:val="0"/>
         <w:widowControl/>
+        <w:suppressAutoHyphens/>
         <w:spacing w:before="0" w:after="120" w:lineRule="auto" w:line="312"/>
         <w:ind w:left="0" w:right="0" w:firstLine="1417"/>
         <w:jc w:val="both"/>
@@ -1756,6 +1826,7 @@
       <w:pPr>
         <w:keepNext w:val="0"/>
         <w:widowControl/>
+        <w:suppressAutoHyphens/>
         <w:spacing w:before="0" w:after="120" w:lineRule="auto" w:line="312"/>
         <w:ind w:left="0" w:right="0" w:firstLine="1417"/>
         <w:jc w:val="both"/>
@@ -1778,6 +1849,7 @@
         <w:pBdr>
           <w:bottom w:val="single" w:sz="8" w:space="3" w:color="1F3864"/>
         </w:pBdr>
+        <w:suppressAutoHyphens/>
         <w:spacing w:before="280" w:after="120" w:lineRule="auto" w:line="276"/>
         <w:ind w:left="0" w:right="0" w:firstLine="0"/>
         <w:jc w:val="left"/>
@@ -1804,6 +1876,7 @@
           <w:right w:val="single" w:sz="4" w:space="6" w:color="C9D3E3"/>
         </w:pBdr>
         <w:shd w:val="clear" w:color="auto" w:fill="EEF2F7"/>
+        <w:suppressAutoHyphens/>
         <w:spacing w:before="0" w:after="200" w:lineRule="auto" w:line="276"/>
         <w:ind w:left="198" w:right="113" w:firstLine="0"/>
         <w:jc w:val="both"/>
@@ -1833,6 +1906,7 @@
       <w:pPr>
         <w:keepNext w:val="0"/>
         <w:widowControl/>
+        <w:suppressAutoHyphens/>
         <w:spacing w:before="0" w:after="120" w:lineRule="auto" w:line="312"/>
         <w:ind w:left="0" w:right="0" w:firstLine="1417"/>
         <w:jc w:val="both"/>
@@ -1852,6 +1926,7 @@
       <w:pPr>
         <w:keepNext w:val="0"/>
         <w:widowControl/>
+        <w:suppressAutoHyphens/>
         <w:spacing w:before="0" w:after="120" w:lineRule="auto" w:line="312"/>
         <w:ind w:left="0" w:right="0" w:firstLine="1417"/>
         <w:jc w:val="both"/>
@@ -1871,6 +1946,7 @@
       <w:pPr>
         <w:keepNext w:val="0"/>
         <w:widowControl/>
+        <w:suppressAutoHyphens/>
         <w:spacing w:before="0" w:after="120" w:lineRule="auto" w:line="312"/>
         <w:ind w:left="0" w:right="0" w:firstLine="1417"/>
         <w:jc w:val="both"/>
@@ -1890,6 +1966,7 @@
       <w:pPr>
         <w:keepNext w:val="0"/>
         <w:widowControl/>
+        <w:suppressAutoHyphens/>
         <w:spacing w:before="0" w:after="120" w:lineRule="auto" w:line="312"/>
         <w:ind w:left="0" w:right="0" w:firstLine="1417"/>
         <w:jc w:val="both"/>
@@ -1909,6 +1986,7 @@
       <w:pPr>
         <w:keepNext w:val="0"/>
         <w:widowControl/>
+        <w:suppressAutoHyphens/>
         <w:spacing w:before="0" w:after="120" w:lineRule="auto" w:line="312"/>
         <w:ind w:left="0" w:right="0" w:firstLine="1417"/>
         <w:jc w:val="both"/>
@@ -1931,6 +2009,7 @@
         <w:pBdr>
           <w:left w:val="single" w:sz="12" w:space="8" w:color="B4C0D3"/>
         </w:pBdr>
+        <w:suppressAutoHyphens/>
         <w:spacing w:before="0" w:after="120" w:lineRule="auto" w:line="252"/>
         <w:ind w:left="2268" w:right="0" w:firstLine="0"/>
         <w:jc w:val="both"/>
@@ -1953,7 +2032,8 @@
         <w:pBdr>
           <w:left w:val="single" w:sz="12" w:space="8" w:color="B4C0D3"/>
         </w:pBdr>
-        <w:spacing w:before="0" w:after="120" w:lineRule="auto" w:line="252"/>
+        <w:suppressAutoHyphens/>
+        <w:spacing w:before="0" w:after="240" w:lineRule="auto" w:line="252"/>
         <w:ind w:left="2268" w:right="0" w:firstLine="0"/>
         <w:jc w:val="both"/>
       </w:pPr>
@@ -1972,6 +2052,7 @@
       <w:pPr>
         <w:keepNext w:val="0"/>
         <w:widowControl/>
+        <w:suppressAutoHyphens/>
         <w:spacing w:before="0" w:after="120" w:lineRule="auto" w:line="312"/>
         <w:ind w:left="0" w:right="0" w:firstLine="1417"/>
         <w:jc w:val="both"/>
@@ -1991,6 +2072,7 @@
       <w:pPr>
         <w:keepNext w:val="0"/>
         <w:widowControl/>
+        <w:suppressAutoHyphens/>
         <w:spacing w:before="0" w:after="120" w:lineRule="auto" w:line="312"/>
         <w:ind w:left="0" w:right="0" w:firstLine="1417"/>
         <w:jc w:val="both"/>
@@ -2010,6 +2092,7 @@
       <w:pPr>
         <w:keepNext w:val="0"/>
         <w:widowControl/>
+        <w:suppressAutoHyphens/>
         <w:spacing w:before="0" w:after="120" w:lineRule="auto" w:line="312"/>
         <w:ind w:left="0" w:right="0" w:firstLine="1417"/>
         <w:jc w:val="both"/>
@@ -2032,6 +2115,7 @@
         <w:pBdr>
           <w:bottom w:val="single" w:sz="8" w:space="3" w:color="1F3864"/>
         </w:pBdr>
+        <w:suppressAutoHyphens/>
         <w:spacing w:before="280" w:after="120" w:lineRule="auto" w:line="276"/>
         <w:ind w:left="0" w:right="0" w:firstLine="0"/>
         <w:jc w:val="left"/>
@@ -2058,6 +2142,7 @@
           <w:right w:val="single" w:sz="4" w:space="6" w:color="C9D3E3"/>
         </w:pBdr>
         <w:shd w:val="clear" w:color="auto" w:fill="EEF2F7"/>
+        <w:suppressAutoHyphens/>
         <w:spacing w:before="0" w:after="200" w:lineRule="auto" w:line="276"/>
         <w:ind w:left="198" w:right="113" w:firstLine="0"/>
         <w:jc w:val="both"/>
@@ -2087,6 +2172,7 @@
       <w:pPr>
         <w:keepNext w:val="0"/>
         <w:widowControl/>
+        <w:suppressAutoHyphens/>
         <w:spacing w:before="0" w:after="120" w:lineRule="auto" w:line="312"/>
         <w:ind w:left="0" w:right="0" w:firstLine="1417"/>
         <w:jc w:val="both"/>
@@ -2106,6 +2192,7 @@
       <w:pPr>
         <w:keepNext w:val="0"/>
         <w:widowControl/>
+        <w:suppressAutoHyphens/>
         <w:spacing w:before="0" w:after="120" w:lineRule="auto" w:line="312"/>
         <w:ind w:left="0" w:right="0" w:firstLine="1417"/>
         <w:jc w:val="both"/>
@@ -2125,6 +2212,7 @@
       <w:pPr>
         <w:keepNext w:val="0"/>
         <w:widowControl/>
+        <w:suppressAutoHyphens/>
         <w:spacing w:before="0" w:after="120" w:lineRule="auto" w:line="312"/>
         <w:ind w:left="0" w:right="0" w:firstLine="1417"/>
         <w:jc w:val="both"/>
@@ -2147,6 +2235,7 @@
         <w:pBdr>
           <w:left w:val="single" w:sz="12" w:space="8" w:color="B4C0D3"/>
         </w:pBdr>
+        <w:suppressAutoHyphens/>
         <w:spacing w:before="0" w:after="120" w:lineRule="auto" w:line="252"/>
         <w:ind w:left="2268" w:right="0" w:firstLine="0"/>
         <w:jc w:val="both"/>
@@ -2169,6 +2258,7 @@
         <w:pBdr>
           <w:left w:val="single" w:sz="12" w:space="8" w:color="B4C0D3"/>
         </w:pBdr>
+        <w:suppressAutoHyphens/>
         <w:spacing w:before="0" w:after="120" w:lineRule="auto" w:line="252"/>
         <w:ind w:left="2268" w:right="0" w:firstLine="0"/>
         <w:jc w:val="both"/>
@@ -2191,6 +2281,7 @@
         <w:pBdr>
           <w:left w:val="single" w:sz="12" w:space="8" w:color="B4C0D3"/>
         </w:pBdr>
+        <w:suppressAutoHyphens/>
         <w:spacing w:before="0" w:after="120" w:lineRule="auto" w:line="252"/>
         <w:ind w:left="2268" w:right="0" w:firstLine="0"/>
         <w:jc w:val="both"/>
@@ -2213,6 +2304,7 @@
         <w:pBdr>
           <w:left w:val="single" w:sz="12" w:space="8" w:color="B4C0D3"/>
         </w:pBdr>
+        <w:suppressAutoHyphens/>
         <w:spacing w:before="0" w:after="120" w:lineRule="auto" w:line="252"/>
         <w:ind w:left="2268" w:right="0" w:firstLine="0"/>
         <w:jc w:val="both"/>
@@ -2235,7 +2327,8 @@
         <w:pBdr>
           <w:left w:val="single" w:sz="12" w:space="8" w:color="B4C0D3"/>
         </w:pBdr>
-        <w:spacing w:before="0" w:after="120" w:lineRule="auto" w:line="252"/>
+        <w:suppressAutoHyphens/>
+        <w:spacing w:before="0" w:after="240" w:lineRule="auto" w:line="252"/>
         <w:ind w:left="2268" w:right="0" w:firstLine="0"/>
         <w:jc w:val="both"/>
       </w:pPr>
@@ -2249,30 +2342,22 @@
         </w:rPr>
         <w:t>5. Considerando a informação que o bem segurado (refrigerador) continua apresentando defeitos, faz jus a parte autora à devolução de seu valor, devendo este ser comprovado pela parte autora mediante a juntada da nota fiscal de compra na fase de cumprimento de sentença. (...)</w:t>
       </w:r>
-    </w:p>
-    <w:p>
-      <w:pPr>
-        <w:keepNext w:val="0"/>
-        <w:widowControl/>
-        <w:spacing w:before="0" w:after="240" w:lineRule="auto" w:line="240"/>
-        <w:ind w:left="2268" w:right="0" w:firstLine="0"/>
-        <w:jc w:val="right"/>
-      </w:pPr>
-      <w:r>
-        <w:rPr>
-          <w:rFonts w:ascii="Arial Narrow" w:hAnsi="Arial Narrow" w:eastAsia="Arial Narrow" w:cs="Arial Narrow"/>
-          <w:b w:val="0"/>
-          <w:i w:val="0"/>
-          <w:color w:val="595959"/>
-          <w:sz w:val="20"/>
-        </w:rPr>
-        <w:t>(TJPR - 2ª Turma Recursal - 0003692-03.2017.8.16.0030 - Foz do Iguaçu - Rel.: JUIZ DE DIREITO DA TURMA RECURSAL DOS JUIZADOS ESPECIAIS ALVARO RODRIGUES JUNIOR - J. 22.08.2018)</w:t>
-      </w:r>
-    </w:p>
-    <w:p>
-      <w:pPr>
-        <w:keepNext w:val="0"/>
-        <w:widowControl/>
+      <w:r>
+        <w:rPr>
+          <w:rFonts w:ascii="Arial Narrow" w:hAnsi="Arial Narrow" w:eastAsia="Arial Narrow" w:cs="Arial Narrow"/>
+          <w:b w:val="0"/>
+          <w:i/>
+          <w:color w:val="333333"/>
+          <w:sz w:val="22"/>
+        </w:rPr>
+        <w:t xml:space="preserve"> (TJPR - 2ª Turma Recursal - 0003692-03.2017.8.16.0030 - Foz do Iguaçu - Rel.: JUIZ DE DIREITO DA TURMA RECURSAL DOS JUIZADOS ESPECIAIS ALVARO RODRIGUES JUNIOR - J. 22.08.2018)</w:t>
+      </w:r>
+    </w:p>
+    <w:p>
+      <w:pPr>
+        <w:keepNext w:val="0"/>
+        <w:widowControl/>
+        <w:suppressAutoHyphens/>
         <w:spacing w:before="0" w:after="120" w:lineRule="auto" w:line="312"/>
         <w:ind w:left="0" w:right="0" w:firstLine="1417"/>
         <w:jc w:val="both"/>
@@ -2292,6 +2377,7 @@
       <w:pPr>
         <w:keepNext w:val="0"/>
         <w:widowControl/>
+        <w:suppressAutoHyphens/>
         <w:spacing w:before="0" w:after="120" w:lineRule="auto" w:line="312"/>
         <w:ind w:left="0" w:right="0" w:firstLine="1417"/>
         <w:jc w:val="both"/>
@@ -2314,6 +2400,7 @@
         <w:pBdr>
           <w:bottom w:val="single" w:sz="8" w:space="3" w:color="1F3864"/>
         </w:pBdr>
+        <w:suppressAutoHyphens/>
         <w:spacing w:before="280" w:after="120" w:lineRule="auto" w:line="276"/>
         <w:ind w:left="0" w:right="0" w:firstLine="0"/>
         <w:jc w:val="left"/>
@@ -2340,6 +2427,7 @@
           <w:right w:val="single" w:sz="4" w:space="6" w:color="C9D3E3"/>
         </w:pBdr>
         <w:shd w:val="clear" w:color="auto" w:fill="EEF2F7"/>
+        <w:suppressAutoHyphens/>
         <w:spacing w:before="0" w:after="200" w:lineRule="auto" w:line="276"/>
         <w:ind w:left="198" w:right="113" w:firstLine="0"/>
         <w:jc w:val="both"/>
@@ -2369,6 +2457,7 @@
       <w:pPr>
         <w:keepNext w:val="0"/>
         <w:widowControl/>
+        <w:suppressAutoHyphens/>
         <w:spacing w:before="0" w:after="120" w:lineRule="auto" w:line="312"/>
         <w:ind w:left="0" w:right="0" w:firstLine="1417"/>
         <w:jc w:val="both"/>
@@ -2388,6 +2477,7 @@
       <w:pPr>
         <w:keepNext w:val="0"/>
         <w:widowControl/>
+        <w:suppressAutoHyphens/>
         <w:spacing w:before="0" w:after="120" w:lineRule="auto" w:line="312"/>
         <w:ind w:left="0" w:right="0" w:firstLine="1417"/>
         <w:jc w:val="both"/>
@@ -2410,6 +2500,7 @@
         <w:pBdr>
           <w:left w:val="single" w:sz="12" w:space="8" w:color="B4C0D3"/>
         </w:pBdr>
+        <w:suppressAutoHyphens/>
         <w:spacing w:before="0" w:after="120" w:lineRule="auto" w:line="252"/>
         <w:ind w:left="2268" w:right="0" w:firstLine="0"/>
         <w:jc w:val="both"/>
@@ -2432,7 +2523,8 @@
         <w:pBdr>
           <w:left w:val="single" w:sz="12" w:space="8" w:color="B4C0D3"/>
         </w:pBdr>
-        <w:spacing w:before="0" w:after="120" w:lineRule="auto" w:line="252"/>
+        <w:suppressAutoHyphens/>
+        <w:spacing w:before="0" w:after="240" w:lineRule="auto" w:line="252"/>
         <w:ind w:left="2268" w:right="0" w:firstLine="0"/>
         <w:jc w:val="both"/>
       </w:pPr>
@@ -2446,30 +2538,22 @@
         </w:rPr>
         <w:t>9. Ademais, independentemente de prazo contratual de garantia, a venda de um bem tido por durável com vida útil inferior àquela que legitimamente se esperava, além de configurar um defeito de adequação (art. 18 do CDC), evidencia uma quebra da boa-fé objetiva, que deve nortear as relações contratuais, sejam de consumo, sejam de direito comum. Constitui, em outras palavras, descumprimento do dever de informação e a não realização do próprio objeto do contrato, que era a compra de um bem cujo ciclo vital se esperava, de forma legítima e razoável, fosse mais longo. (...)</w:t>
       </w:r>
-    </w:p>
-    <w:p>
-      <w:pPr>
-        <w:keepNext w:val="0"/>
-        <w:widowControl/>
-        <w:spacing w:before="0" w:after="240" w:lineRule="auto" w:line="240"/>
-        <w:ind w:left="2268" w:right="0" w:firstLine="0"/>
-        <w:jc w:val="right"/>
-      </w:pPr>
-      <w:r>
-        <w:rPr>
-          <w:rFonts w:ascii="Arial Narrow" w:hAnsi="Arial Narrow" w:eastAsia="Arial Narrow" w:cs="Arial Narrow"/>
-          <w:b w:val="0"/>
-          <w:i w:val="0"/>
-          <w:color w:val="595959"/>
-          <w:sz w:val="20"/>
-        </w:rPr>
-        <w:t>(REsp 984106/SC/Órgão Julgador: 4ª Turma/ Relator: Min. Luiz Felipe Salomão/j. 04/10/2012)</w:t>
-      </w:r>
-    </w:p>
-    <w:p>
-      <w:pPr>
-        <w:keepNext w:val="0"/>
-        <w:widowControl/>
+      <w:r>
+        <w:rPr>
+          <w:rFonts w:ascii="Arial Narrow" w:hAnsi="Arial Narrow" w:eastAsia="Arial Narrow" w:cs="Arial Narrow"/>
+          <w:b w:val="0"/>
+          <w:i/>
+          <w:color w:val="333333"/>
+          <w:sz w:val="22"/>
+        </w:rPr>
+        <w:t xml:space="preserve"> (REsp 984106/SC/Órgão Julgador: 4ª Turma/ Relator: Min. Luiz Felipe Salomão/j. 04/10/2012)</w:t>
+      </w:r>
+    </w:p>
+    <w:p>
+      <w:pPr>
+        <w:keepNext w:val="0"/>
+        <w:widowControl/>
+        <w:suppressAutoHyphens/>
         <w:spacing w:before="0" w:after="120" w:lineRule="auto" w:line="312"/>
         <w:ind w:left="0" w:right="0" w:firstLine="1417"/>
         <w:jc w:val="both"/>
@@ -2492,6 +2576,7 @@
         <w:pBdr>
           <w:left w:val="single" w:sz="12" w:space="8" w:color="B4C0D3"/>
         </w:pBdr>
+        <w:suppressAutoHyphens/>
         <w:spacing w:before="0" w:after="120" w:lineRule="auto" w:line="252"/>
         <w:ind w:left="2268" w:right="0" w:firstLine="0"/>
         <w:jc w:val="both"/>
@@ -2514,6 +2599,7 @@
         <w:pBdr>
           <w:left w:val="single" w:sz="12" w:space="8" w:color="B4C0D3"/>
         </w:pBdr>
+        <w:suppressAutoHyphens/>
         <w:spacing w:before="0" w:after="120" w:lineRule="auto" w:line="252"/>
         <w:ind w:left="2268" w:right="0" w:firstLine="0"/>
         <w:jc w:val="both"/>
@@ -2536,6 +2622,7 @@
         <w:pBdr>
           <w:left w:val="single" w:sz="12" w:space="8" w:color="B4C0D3"/>
         </w:pBdr>
+        <w:suppressAutoHyphens/>
         <w:spacing w:before="0" w:after="120" w:lineRule="auto" w:line="252"/>
         <w:ind w:left="2268" w:right="0" w:firstLine="0"/>
         <w:jc w:val="both"/>
@@ -2558,7 +2645,8 @@
         <w:pBdr>
           <w:left w:val="single" w:sz="12" w:space="8" w:color="B4C0D3"/>
         </w:pBdr>
-        <w:spacing w:before="0" w:after="120" w:lineRule="auto" w:line="252"/>
+        <w:suppressAutoHyphens/>
+        <w:spacing w:before="0" w:after="240" w:lineRule="auto" w:line="252"/>
         <w:ind w:left="2268" w:right="0" w:firstLine="0"/>
         <w:jc w:val="both"/>
       </w:pPr>
@@ -2577,6 +2665,7 @@
       <w:pPr>
         <w:keepNext w:val="0"/>
         <w:widowControl/>
+        <w:suppressAutoHyphens/>
         <w:spacing w:before="0" w:after="120" w:lineRule="auto" w:line="312"/>
         <w:ind w:left="0" w:right="0" w:firstLine="1417"/>
         <w:jc w:val="both"/>
@@ -2596,6 +2685,7 @@
       <w:pPr>
         <w:keepNext w:val="0"/>
         <w:widowControl/>
+        <w:suppressAutoHyphens/>
         <w:spacing w:before="0" w:after="120" w:lineRule="auto" w:line="312"/>
         <w:ind w:left="0" w:right="0" w:firstLine="1417"/>
         <w:jc w:val="both"/>
@@ -2618,7 +2708,8 @@
         <w:pBdr>
           <w:left w:val="single" w:sz="12" w:space="8" w:color="B4C0D3"/>
         </w:pBdr>
-        <w:spacing w:before="0" w:after="120" w:lineRule="auto" w:line="252"/>
+        <w:suppressAutoHyphens/>
+        <w:spacing w:before="0" w:after="240" w:lineRule="auto" w:line="252"/>
         <w:ind w:left="2268" w:right="0" w:firstLine="0"/>
         <w:jc w:val="both"/>
       </w:pPr>
@@ -2632,30 +2723,22 @@
         </w:rPr>
         <w:t>RECURSO INOMINADO. MATÉRIA RESIDUAL. AÇÃO DE INDENIZAÇÃO POR DANOS MORAIS C/C RESTITUIÇÃO DE VALORES. COMPRA DE REFRIGERADOR COM VÍCIO. SENTENÇA DE PARCIAL PROCEDÊNCIA. INSURGÊNCIA RECURSAL DA REQUERIDA. RELAÇÃO DE CONSUMO. INVERSÃO DO ÔNUS DA PROVA. AUTOR QUE APRESENTOU PROVAS MÍNIMAS DO VÍCIO E DA TENTATIVA DE SOLUÇÃO ADMINISTRATIVA. AUSÊNCIA DE PROVA DE CULPA EXCLUSIVA DO CONSUMIDOR. GELADEIRA. BEM ESSENCIAL. APLICAÇÃO DO ART. 18, § 3º, DO CDC. RESTITUIÇÃO INTEGRAL DEVIDA. DANO MORAL CONFIGURADO. DESCASO COM O CONSUMIDOR QUE ULTRAPASSA O MERO ABORRECIMENTO. QUANTUM FIXADO EM R$ 3.000,00 EM OBSERVÂNCIA À RAZOABILIDADE E PROPORCIONALIDADE. SENTENÇA MANTIDA POR SEUS PRÓPRIOS FUNDAMENTOS. RECURSO CONHECIDO E DESPROVIDO. (...)</w:t>
       </w:r>
-    </w:p>
-    <w:p>
-      <w:pPr>
-        <w:keepNext w:val="0"/>
-        <w:widowControl/>
-        <w:spacing w:before="0" w:after="240" w:lineRule="auto" w:line="240"/>
-        <w:ind w:left="2268" w:right="0" w:firstLine="0"/>
-        <w:jc w:val="right"/>
-      </w:pPr>
-      <w:r>
-        <w:rPr>
-          <w:rFonts w:ascii="Arial Narrow" w:hAnsi="Arial Narrow" w:eastAsia="Arial Narrow" w:cs="Arial Narrow"/>
-          <w:b w:val="0"/>
-          <w:i w:val="0"/>
-          <w:color w:val="595959"/>
-          <w:sz w:val="20"/>
-        </w:rPr>
-        <w:t>(TJPR - 3ª Turma Recursal - 0001724-24.2025.8.16.0137 - Porecatu - Rel.: JUÍZA DE DIREITO SUBSTITUTO HELÊNIKA VALENTE DE SOUZA PINTO - J. 18.09.2026)</w:t>
-      </w:r>
-    </w:p>
-    <w:p>
-      <w:pPr>
-        <w:keepNext w:val="0"/>
-        <w:widowControl/>
+      <w:r>
+        <w:rPr>
+          <w:rFonts w:ascii="Arial Narrow" w:hAnsi="Arial Narrow" w:eastAsia="Arial Narrow" w:cs="Arial Narrow"/>
+          <w:b w:val="0"/>
+          <w:i/>
+          <w:color w:val="333333"/>
+          <w:sz w:val="22"/>
+        </w:rPr>
+        <w:t xml:space="preserve"> (TJPR - 3ª Turma Recursal - 0001724-24.2025.8.16.0137 - Porecatu - Rel.: JUÍZA DE DIREITO SUBSTITUTO HELÊNIKA VALENTE DE SOUZA PINTO - J. 18.09.2026)</w:t>
+      </w:r>
+    </w:p>
+    <w:p>
+      <w:pPr>
+        <w:keepNext w:val="0"/>
+        <w:widowControl/>
+        <w:suppressAutoHyphens/>
         <w:spacing w:before="0" w:after="120" w:lineRule="auto" w:line="312"/>
         <w:ind w:left="0" w:right="0" w:firstLine="1417"/>
         <w:jc w:val="both"/>
@@ -2678,7 +2761,8 @@
         <w:pBdr>
           <w:left w:val="single" w:sz="12" w:space="8" w:color="B4C0D3"/>
         </w:pBdr>
-        <w:spacing w:before="0" w:after="120" w:lineRule="auto" w:line="252"/>
+        <w:suppressAutoHyphens/>
+        <w:spacing w:before="0" w:after="240" w:lineRule="auto" w:line="252"/>
         <w:ind w:left="2268" w:right="0" w:firstLine="0"/>
         <w:jc w:val="both"/>
       </w:pPr>
@@ -2692,30 +2776,22 @@
         </w:rPr>
         <w:t>RECURSO INOMINADO. AÇÃO DE OBRIGAÇÃO DE FAZER C/C INDENIZAÇÃO POR DANOS MORAIS E MATERIAIS. VÍCIO NO PRODUTO. REFRIGERADOR. NEGATIVA DE SEGURO. AUSÊNCIA DE SOLUÇÃO ADMINISTRATIVA. FALHA NA PRESTAÇÃO DO SERVIÇO. RÉ QUE NÃO SE DESINCUMBIU DO SEU ÔNUS PROBATÓRIO. DANO MORAL CONFIGURADO. APLICAÇÃO DO ENUNCIADO N° 1 DA PRIMEIRA TURMA RECURSAL/PR. QUANTUM FIXADO EM R$ 3.000,00 (TRÊS MIL REAIS) QUE NÃO COMPORTA MINORAÇÃO. OBSERVÂNCIA AOS PRINCÍPIOS DA RAZOABILIDADE E PROPORCIONALIDADE, BEM COMO AOS PARÂMETROS DESTA TURMA RECURSAL. SENTENÇA MANTIDA POR SEUS PRÓPRIOS FUNDAMENTOS.Recurso conhecido e desprovido.</w:t>
       </w:r>
-    </w:p>
-    <w:p>
-      <w:pPr>
-        <w:keepNext w:val="0"/>
-        <w:widowControl/>
-        <w:spacing w:before="0" w:after="240" w:lineRule="auto" w:line="240"/>
-        <w:ind w:left="2268" w:right="0" w:firstLine="0"/>
-        <w:jc w:val="right"/>
-      </w:pPr>
-      <w:r>
-        <w:rPr>
-          <w:rFonts w:ascii="Arial Narrow" w:hAnsi="Arial Narrow" w:eastAsia="Arial Narrow" w:cs="Arial Narrow"/>
-          <w:b w:val="0"/>
-          <w:i w:val="0"/>
-          <w:color w:val="595959"/>
-          <w:sz w:val="20"/>
-        </w:rPr>
-        <w:t>(TJPR - 1ª Turma Recursal - 0000795-25.2019.8.16.0129 - Paranaguá - Rel.: JUIZ DE DIREITO DA TURMA RECURSAL DOS JUIZADOS ESPECIAIS NESTARIO DA SILVA QUEIROZ - J. 14.12.2020)</w:t>
-      </w:r>
-    </w:p>
-    <w:p>
-      <w:pPr>
-        <w:keepNext w:val="0"/>
-        <w:widowControl/>
+      <w:r>
+        <w:rPr>
+          <w:rFonts w:ascii="Arial Narrow" w:hAnsi="Arial Narrow" w:eastAsia="Arial Narrow" w:cs="Arial Narrow"/>
+          <w:b w:val="0"/>
+          <w:i/>
+          <w:color w:val="333333"/>
+          <w:sz w:val="22"/>
+        </w:rPr>
+        <w:t xml:space="preserve"> (TJPR - 1ª Turma Recursal - 0000795-25.2019.8.16.0129 - Paranaguá - Rel.: JUIZ DE DIREITO DA TURMA RECURSAL DOS JUIZADOS ESPECIAIS NESTARIO DA SILVA QUEIROZ - J. 14.12.2020)</w:t>
+      </w:r>
+    </w:p>
+    <w:p>
+      <w:pPr>
+        <w:keepNext w:val="0"/>
+        <w:widowControl/>
+        <w:suppressAutoHyphens/>
         <w:spacing w:before="0" w:after="120" w:lineRule="auto" w:line="312"/>
         <w:ind w:left="0" w:right="0" w:firstLine="1417"/>
         <w:jc w:val="both"/>
@@ -2735,6 +2811,7 @@
       <w:pPr>
         <w:keepNext w:val="0"/>
         <w:widowControl/>
+        <w:suppressAutoHyphens/>
         <w:spacing w:before="0" w:after="120" w:lineRule="auto" w:line="312"/>
         <w:ind w:left="0" w:right="0" w:firstLine="1417"/>
         <w:jc w:val="both"/>
@@ -2757,6 +2834,7 @@
         <w:pBdr>
           <w:bottom w:val="single" w:sz="8" w:space="3" w:color="1F3864"/>
         </w:pBdr>
+        <w:suppressAutoHyphens/>
         <w:spacing w:before="280" w:after="120" w:lineRule="auto" w:line="276"/>
         <w:ind w:left="0" w:right="0" w:firstLine="0"/>
         <w:jc w:val="left"/>
@@ -2783,6 +2861,7 @@
           <w:right w:val="single" w:sz="4" w:space="6" w:color="C9D3E3"/>
         </w:pBdr>
         <w:shd w:val="clear" w:color="auto" w:fill="EEF2F7"/>
+        <w:suppressAutoHyphens/>
         <w:spacing w:before="0" w:after="200" w:lineRule="auto" w:line="276"/>
         <w:ind w:left="198" w:right="113" w:firstLine="0"/>
         <w:jc w:val="both"/>
@@ -2812,6 +2891,7 @@
       <w:pPr>
         <w:keepNext w:val="0"/>
         <w:widowControl/>
+        <w:suppressAutoHyphens/>
         <w:spacing w:before="0" w:after="120" w:lineRule="auto" w:line="312"/>
         <w:ind w:left="0" w:right="0" w:firstLine="1417"/>
         <w:jc w:val="both"/>
@@ -2831,6 +2911,7 @@
       <w:pPr>
         <w:keepNext w:val="0"/>
         <w:widowControl/>
+        <w:suppressAutoHyphens/>
         <w:spacing w:before="0" w:after="120" w:lineRule="auto" w:line="312"/>
         <w:ind w:left="0" w:right="0" w:firstLine="1417"/>
         <w:jc w:val="both"/>
@@ -2850,6 +2931,7 @@
       <w:pPr>
         <w:keepNext w:val="0"/>
         <w:widowControl/>
+        <w:suppressAutoHyphens/>
         <w:spacing w:before="0" w:after="120" w:lineRule="auto" w:line="312"/>
         <w:ind w:left="0" w:right="0" w:firstLine="1417"/>
         <w:jc w:val="both"/>
@@ -2872,7 +2954,8 @@
         <w:pBdr>
           <w:left w:val="single" w:sz="12" w:space="8" w:color="B4C0D3"/>
         </w:pBdr>
-        <w:spacing w:before="0" w:after="120" w:lineRule="auto" w:line="252"/>
+        <w:suppressAutoHyphens/>
+        <w:spacing w:before="0" w:after="240" w:lineRule="auto" w:line="252"/>
         <w:ind w:left="2268" w:right="0" w:firstLine="0"/>
         <w:jc w:val="both"/>
       </w:pPr>
@@ -2891,6 +2974,7 @@
       <w:pPr>
         <w:keepNext w:val="0"/>
         <w:widowControl/>
+        <w:suppressAutoHyphens/>
         <w:spacing w:before="0" w:after="120" w:lineRule="auto" w:line="312"/>
         <w:ind w:left="0" w:right="0" w:firstLine="1417"/>
         <w:jc w:val="both"/>
@@ -2910,6 +2994,7 @@
       <w:pPr>
         <w:keepNext w:val="0"/>
         <w:widowControl/>
+        <w:suppressAutoHyphens/>
         <w:spacing w:before="0" w:after="120" w:lineRule="auto" w:line="312"/>
         <w:ind w:left="0" w:right="0" w:firstLine="1417"/>
         <w:jc w:val="both"/>
@@ -2932,6 +3017,7 @@
         <w:pBdr>
           <w:bottom w:val="single" w:sz="8" w:space="3" w:color="1F3864"/>
         </w:pBdr>
+        <w:suppressAutoHyphens/>
         <w:spacing w:before="280" w:after="120" w:lineRule="auto" w:line="276"/>
         <w:ind w:left="0" w:right="0" w:firstLine="0"/>
         <w:jc w:val="left"/>
@@ -2958,6 +3044,7 @@
           <w:right w:val="single" w:sz="4" w:space="6" w:color="C9D3E3"/>
         </w:pBdr>
         <w:shd w:val="clear" w:color="auto" w:fill="EEF2F7"/>
+        <w:suppressAutoHyphens/>
         <w:spacing w:before="0" w:after="200" w:lineRule="auto" w:line="276"/>
         <w:ind w:left="198" w:right="113" w:firstLine="0"/>
         <w:jc w:val="both"/>
@@ -2987,6 +3074,7 @@
       <w:pPr>
         <w:keepNext w:val="0"/>
         <w:widowControl/>
+        <w:suppressAutoHyphens/>
         <w:spacing w:before="0" w:after="120" w:lineRule="auto" w:line="312"/>
         <w:ind w:left="0" w:right="0" w:firstLine="1417"/>
         <w:jc w:val="both"/>
@@ -3006,6 +3094,7 @@
       <w:pPr>
         <w:keepNext w:val="0"/>
         <w:widowControl/>
+        <w:suppressAutoHyphens/>
         <w:spacing w:before="0" w:after="120" w:lineRule="auto" w:line="312"/>
         <w:ind w:left="0" w:right="0" w:firstLine="1417"/>
         <w:jc w:val="both"/>
@@ -3025,6 +3114,7 @@
       <w:pPr>
         <w:keepNext w:val="0"/>
         <w:widowControl/>
+        <w:suppressAutoHyphens/>
         <w:spacing w:before="0" w:after="120" w:lineRule="auto" w:line="312"/>
         <w:ind w:left="0" w:right="0" w:firstLine="1417"/>
         <w:jc w:val="both"/>
@@ -3044,6 +3134,7 @@
       <w:pPr>
         <w:keepNext w:val="0"/>
         <w:widowControl/>
+        <w:suppressAutoHyphens/>
         <w:spacing w:before="0" w:after="120" w:lineRule="auto" w:line="312"/>
         <w:ind w:left="0" w:right="0" w:firstLine="1417"/>
         <w:jc w:val="both"/>
@@ -3066,6 +3157,7 @@
         <w:pBdr>
           <w:left w:val="single" w:sz="12" w:space="8" w:color="B4C0D3"/>
         </w:pBdr>
+        <w:suppressAutoHyphens/>
         <w:spacing w:before="0" w:after="120" w:lineRule="auto" w:line="252"/>
         <w:ind w:left="2268" w:right="0" w:firstLine="0"/>
         <w:jc w:val="both"/>
@@ -3088,7 +3180,8 @@
         <w:pBdr>
           <w:left w:val="single" w:sz="12" w:space="8" w:color="B4C0D3"/>
         </w:pBdr>
-        <w:spacing w:before="0" w:after="120" w:lineRule="auto" w:line="252"/>
+        <w:suppressAutoHyphens/>
+        <w:spacing w:before="0" w:after="240" w:lineRule="auto" w:line="252"/>
         <w:ind w:left="2268" w:right="0" w:firstLine="0"/>
         <w:jc w:val="both"/>
       </w:pPr>
@@ -3107,6 +3200,7 @@
       <w:pPr>
         <w:keepNext w:val="0"/>
         <w:widowControl/>
+        <w:suppressAutoHyphens/>
         <w:spacing w:before="0" w:after="120" w:lineRule="auto" w:line="312"/>
         <w:ind w:left="0" w:right="0" w:firstLine="1417"/>
         <w:jc w:val="both"/>
@@ -3126,6 +3220,7 @@
       <w:pPr>
         <w:keepNext w:val="0"/>
         <w:widowControl/>
+        <w:suppressAutoHyphens/>
         <w:spacing w:before="0" w:after="120" w:lineRule="auto" w:line="312"/>
         <w:ind w:left="0" w:right="0" w:firstLine="1417"/>
         <w:jc w:val="both"/>
@@ -3145,6 +3240,7 @@
       <w:pPr>
         <w:keepNext w:val="0"/>
         <w:widowControl/>
+        <w:suppressAutoHyphens/>
         <w:spacing w:before="0" w:after="120" w:lineRule="auto" w:line="312"/>
         <w:ind w:left="0" w:right="0" w:firstLine="1417"/>
         <w:jc w:val="both"/>
@@ -3167,7 +3263,8 @@
         <w:pBdr>
           <w:left w:val="single" w:sz="12" w:space="8" w:color="B4C0D3"/>
         </w:pBdr>
-        <w:spacing w:before="0" w:after="120" w:lineRule="auto" w:line="252"/>
+        <w:suppressAutoHyphens/>
+        <w:spacing w:before="0" w:after="240" w:lineRule="auto" w:line="252"/>
         <w:ind w:left="2268" w:right="0" w:firstLine="0"/>
         <w:jc w:val="both"/>
       </w:pPr>
@@ -3181,30 +3278,22 @@
         </w:rPr>
         <w:t>RECURSO INOMINADO. DIREITO DO CONSUMIDOR. VÍCIO DO PRODUTO. GELADEIRA. BEM ESSENCIAL. DEFEITO APRESENTADO COM POUCO TEMPO DE USO. FRUSTRAÇÃO DA VIDA ÚTIL DO BEM. RESPONSABILIDADE OBJETIVA E SOLIDÁRIA DA FABRICANTE E DA ASSISTÊNCIA TÉCNICA (ARTS. 7º, 12 E 18 DO CDC). SUCESSIVAS TENTATIVAS ADMINISTRATIVAS INFRUTÍFERAS. DEMORA EXCESSIVA NA SOLUÇÃO DO VÍCIO. INEFICIÊNCIA DO PÓS‑VENDA. DESVIO PRODUTIVO DO CONSUMIDOR. PERDA DO TEMPO ÚTIL. DANO MORAL CONFIGURADO. APLICAÇÃO DO ENUNCIADO Nº 8.3 DAS TURMAS RECURSAIS DO PARANÁ. SENTENÇA MANTIDA POR SEUS PRÓPRIOS FUNDAMENTOS. RECURSO CONHECIDO E DESPROVIDO. (...)</w:t>
       </w:r>
-    </w:p>
-    <w:p>
-      <w:pPr>
-        <w:keepNext w:val="0"/>
-        <w:widowControl/>
-        <w:spacing w:before="0" w:after="240" w:lineRule="auto" w:line="240"/>
-        <w:ind w:left="2268" w:right="0" w:firstLine="0"/>
-        <w:jc w:val="right"/>
-      </w:pPr>
-      <w:r>
-        <w:rPr>
-          <w:rFonts w:ascii="Arial Narrow" w:hAnsi="Arial Narrow" w:eastAsia="Arial Narrow" w:cs="Arial Narrow"/>
-          <w:b w:val="0"/>
-          <w:i w:val="0"/>
-          <w:color w:val="595959"/>
-          <w:sz w:val="20"/>
-        </w:rPr>
-        <w:t>(TJPR - 3ª Turma Recursal - 0036980-87.2025.8.16.0182 - Curitiba - Rel.: JUÍZA DE DIREITO SUBSTITUTO HELÊNIKA VALENTE DE SOUZA PINTO - J. 20.07.2026)</w:t>
-      </w:r>
-    </w:p>
-    <w:p>
-      <w:pPr>
-        <w:keepNext w:val="0"/>
-        <w:widowControl/>
+      <w:r>
+        <w:rPr>
+          <w:rFonts w:ascii="Arial Narrow" w:hAnsi="Arial Narrow" w:eastAsia="Arial Narrow" w:cs="Arial Narrow"/>
+          <w:b w:val="0"/>
+          <w:i/>
+          <w:color w:val="333333"/>
+          <w:sz w:val="22"/>
+        </w:rPr>
+        <w:t xml:space="preserve"> (TJPR - 3ª Turma Recursal - 0036980-87.2025.8.16.0182 - Curitiba - Rel.: JUÍZA DE DIREITO SUBSTITUTO HELÊNIKA VALENTE DE SOUZA PINTO - J. 20.07.2026)</w:t>
+      </w:r>
+    </w:p>
+    <w:p>
+      <w:pPr>
+        <w:keepNext w:val="0"/>
+        <w:widowControl/>
+        <w:suppressAutoHyphens/>
         <w:spacing w:before="0" w:after="120" w:lineRule="auto" w:line="312"/>
         <w:ind w:left="0" w:right="0" w:firstLine="1417"/>
         <w:jc w:val="both"/>
@@ -3224,6 +3313,7 @@
       <w:pPr>
         <w:keepNext w:val="0"/>
         <w:widowControl/>
+        <w:suppressAutoHyphens/>
         <w:spacing w:before="0" w:after="120" w:lineRule="auto" w:line="312"/>
         <w:ind w:left="0" w:right="0" w:firstLine="1417"/>
         <w:jc w:val="both"/>
@@ -3246,7 +3336,8 @@
         <w:pBdr>
           <w:left w:val="single" w:sz="12" w:space="8" w:color="B4C0D3"/>
         </w:pBdr>
-        <w:spacing w:before="0" w:after="120" w:lineRule="auto" w:line="252"/>
+        <w:suppressAutoHyphens/>
+        <w:spacing w:before="0" w:after="240" w:lineRule="auto" w:line="252"/>
         <w:ind w:left="2268" w:right="0" w:firstLine="0"/>
         <w:jc w:val="both"/>
       </w:pPr>
@@ -3265,6 +3356,7 @@
       <w:pPr>
         <w:keepNext w:val="0"/>
         <w:widowControl/>
+        <w:suppressAutoHyphens/>
         <w:spacing w:before="0" w:after="120" w:lineRule="auto" w:line="312"/>
         <w:ind w:left="0" w:right="0" w:firstLine="1417"/>
         <w:jc w:val="both"/>
@@ -3287,7 +3379,8 @@
         <w:pBdr>
           <w:left w:val="single" w:sz="12" w:space="8" w:color="B4C0D3"/>
         </w:pBdr>
-        <w:spacing w:before="0" w:after="120" w:lineRule="auto" w:line="252"/>
+        <w:suppressAutoHyphens/>
+        <w:spacing w:before="0" w:after="240" w:lineRule="auto" w:line="252"/>
         <w:ind w:left="2268" w:right="0" w:firstLine="0"/>
         <w:jc w:val="both"/>
       </w:pPr>
@@ -3301,30 +3394,22 @@
         </w:rPr>
         <w:t>"a teoria do desvio produtivo parte do pressuposto de que haveria uma obrigação imposta aos fornecedores de garantir a otimização e o máximo aproveitamento dos recursos produtivos disponíveis na sociedade, entre eles, o tempo.Assim, para os seus partidários, a referida teoria seria aplicável sempre que o fornecedor buscar se eximir da sua responsabilidade de sanar os infortúnios criados aos consumidores de forma voluntária, tempestiva e efetiva, levando a parte vulnerável da relação a desperdiçar o seu tempo e a desviar de suas atividades normais para solucionar o problema que lhe foi imposto"</w:t>
       </w:r>
-    </w:p>
-    <w:p>
-      <w:pPr>
-        <w:keepNext w:val="0"/>
-        <w:widowControl/>
-        <w:spacing w:before="0" w:after="240" w:lineRule="auto" w:line="240"/>
-        <w:ind w:left="2268" w:right="0" w:firstLine="0"/>
-        <w:jc w:val="right"/>
-      </w:pPr>
-      <w:r>
-        <w:rPr>
-          <w:rFonts w:ascii="Arial Narrow" w:hAnsi="Arial Narrow" w:eastAsia="Arial Narrow" w:cs="Arial Narrow"/>
-          <w:b w:val="0"/>
-          <w:i w:val="0"/>
-          <w:color w:val="595959"/>
-          <w:sz w:val="20"/>
-        </w:rPr>
-        <w:t>(EDcl no AgInt no AREsp n. 2.393.261/BA, relatora Ministra Maria Isabel Gallotti, Quarta Turma, julgado em 9/9/2024, DJe de 12/9/2024)</w:t>
-      </w:r>
-    </w:p>
-    <w:p>
-      <w:pPr>
-        <w:keepNext w:val="0"/>
-        <w:widowControl/>
+      <w:r>
+        <w:rPr>
+          <w:rFonts w:ascii="Arial Narrow" w:hAnsi="Arial Narrow" w:eastAsia="Arial Narrow" w:cs="Arial Narrow"/>
+          <w:b w:val="0"/>
+          <w:i/>
+          <w:color w:val="333333"/>
+          <w:sz w:val="22"/>
+        </w:rPr>
+        <w:t xml:space="preserve"> (EDcl no AgInt no AREsp n. 2.393.261/BA, relatora Ministra Maria Isabel Gallotti, Quarta Turma, julgado em 9/9/2024, DJe de 12/9/2024)</w:t>
+      </w:r>
+    </w:p>
+    <w:p>
+      <w:pPr>
+        <w:keepNext w:val="0"/>
+        <w:widowControl/>
+        <w:suppressAutoHyphens/>
         <w:spacing w:before="0" w:after="120" w:lineRule="auto" w:line="312"/>
         <w:ind w:left="0" w:right="0" w:firstLine="1417"/>
         <w:jc w:val="both"/>
@@ -3344,6 +3429,7 @@
       <w:pPr>
         <w:keepNext w:val="0"/>
         <w:widowControl/>
+        <w:suppressAutoHyphens/>
         <w:spacing w:before="0" w:after="120" w:lineRule="auto" w:line="312"/>
         <w:ind w:left="0" w:right="0" w:firstLine="1417"/>
         <w:jc w:val="both"/>
@@ -3363,6 +3449,7 @@
       <w:pPr>
         <w:keepNext w:val="0"/>
         <w:widowControl/>
+        <w:suppressAutoHyphens/>
         <w:spacing w:before="0" w:after="120" w:lineRule="auto" w:line="312"/>
         <w:ind w:left="0" w:right="0" w:firstLine="1417"/>
         <w:jc w:val="both"/>
@@ -3385,7 +3472,8 @@
         <w:pBdr>
           <w:left w:val="single" w:sz="12" w:space="8" w:color="B4C0D3"/>
         </w:pBdr>
-        <w:spacing w:before="0" w:after="120" w:lineRule="auto" w:line="252"/>
+        <w:suppressAutoHyphens/>
+        <w:spacing w:before="0" w:after="240" w:lineRule="auto" w:line="252"/>
         <w:ind w:left="2268" w:right="0" w:firstLine="0"/>
         <w:jc w:val="both"/>
       </w:pPr>
@@ -3399,30 +3487,22 @@
         </w:rPr>
         <w:t>APELAÇÃO CÍVEL – AÇÃO DE INDENIZAÇÃO POR DANOS MATERIAIS E MORAIS – FALHA NA PRESTAÇÃO DO SERVIÇO DE VENDA DE MÁQUINA DE LAVAR LOUÇAS – SENTENÇA DE PARCIAL PROCEDÊNCIA. (...) MÉRITO – RECURSO DO AUTOR – DANOS MORAIS – OCORRÊNCIA – SITUAÇÃO QUE ULTRAPASSA O MERO DISSABOR COTIDIANO – DEMANDANTE QUE É PESSOA IDOSA, COM OITENTA E UM ANOS – BEM NOVO, ADQUIRIDO PELA INTERNET – VÍCIO DO PRODUTO – AUTOR QUE TEVE QUE ENTRAR COM CONTATO COM A REQUERIDA INÚMERAS VEZES PARA RESOLVER A SITUAÇÃO – COMPROVAÇÃO DE ABALO EXTRAORDINÁRIO À HONRA – VIOLAÇÃO AOS DIREITOS DA PERSONALIDADE – DANO MORAL ARBITRADO EM R$ 5.000,00 (CINCO MIL REAIS) – SENTENÇA REFORMADA, PARA JULGAR PROCEDENTES OS PEDIDOS INICIAIS – REDISTRIBUIÇÃO DA SUCUMBÊNCIA.RECURSO DE APELAÇÃO CONHECIDO E PROVIDO. (...) 2. Considerando-se as peculiaridades do caso concreto, as funções pedagógica e inibitória da reprimenda, o caráter compensatório pela aflição e intranquilidade causadas pelo ato ilícito, a gravidade e a duração da lesão, a possibilidade de quem deve reparar o dano e as condições econômicas e sociais do ofendido, necessário o arbitramento da indenização referente aos danos morais, em R$ 5.000,00 (cinco mil reais), quantia que se mostra razoável e proporcional.</w:t>
       </w:r>
-    </w:p>
-    <w:p>
-      <w:pPr>
-        <w:keepNext w:val="0"/>
-        <w:widowControl/>
-        <w:spacing w:before="0" w:after="240" w:lineRule="auto" w:line="240"/>
-        <w:ind w:left="2268" w:right="0" w:firstLine="0"/>
-        <w:jc w:val="right"/>
-      </w:pPr>
-      <w:r>
-        <w:rPr>
-          <w:rFonts w:ascii="Arial Narrow" w:hAnsi="Arial Narrow" w:eastAsia="Arial Narrow" w:cs="Arial Narrow"/>
-          <w:b w:val="0"/>
-          <w:i w:val="0"/>
-          <w:color w:val="595959"/>
-          <w:sz w:val="20"/>
-        </w:rPr>
-        <w:t>(TJPR - 8ª Câmara Cível - 0012313-27.2023.8.16.0014 - Londrina - Rel.: SUBSTITUTO ADEMIR RIBEIRO RICHTER - J. 07.11.2024)</w:t>
-      </w:r>
-    </w:p>
-    <w:p>
-      <w:pPr>
-        <w:keepNext w:val="0"/>
-        <w:widowControl/>
+      <w:r>
+        <w:rPr>
+          <w:rFonts w:ascii="Arial Narrow" w:hAnsi="Arial Narrow" w:eastAsia="Arial Narrow" w:cs="Arial Narrow"/>
+          <w:b w:val="0"/>
+          <w:i/>
+          <w:color w:val="333333"/>
+          <w:sz w:val="22"/>
+        </w:rPr>
+        <w:t xml:space="preserve"> (TJPR - 8ª Câmara Cível - 0012313-27.2023.8.16.0014 - Londrina - Rel.: SUBSTITUTO ADEMIR RIBEIRO RICHTER - J. 07.11.2024)</w:t>
+      </w:r>
+    </w:p>
+    <w:p>
+      <w:pPr>
+        <w:keepNext w:val="0"/>
+        <w:widowControl/>
+        <w:suppressAutoHyphens/>
         <w:spacing w:before="0" w:after="120" w:lineRule="auto" w:line="312"/>
         <w:ind w:left="0" w:right="0" w:firstLine="1417"/>
         <w:jc w:val="both"/>
@@ -3442,6 +3522,7 @@
       <w:pPr>
         <w:keepNext w:val="0"/>
         <w:widowControl/>
+        <w:suppressAutoHyphens/>
         <w:spacing w:before="0" w:after="120" w:lineRule="auto" w:line="312"/>
         <w:ind w:left="0" w:right="0" w:firstLine="1417"/>
         <w:jc w:val="both"/>
@@ -3464,6 +3545,7 @@
         <w:pBdr>
           <w:left w:val="single" w:sz="12" w:space="8" w:color="B4C0D3"/>
         </w:pBdr>
+        <w:suppressAutoHyphens/>
         <w:spacing w:before="0" w:after="120" w:lineRule="auto" w:line="252"/>
         <w:ind w:left="2268" w:right="0" w:firstLine="0"/>
         <w:jc w:val="both"/>
@@ -3486,7 +3568,8 @@
         <w:pBdr>
           <w:left w:val="single" w:sz="12" w:space="8" w:color="B4C0D3"/>
         </w:pBdr>
-        <w:spacing w:before="0" w:after="120" w:lineRule="auto" w:line="252"/>
+        <w:suppressAutoHyphens/>
+        <w:spacing w:before="0" w:after="240" w:lineRule="auto" w:line="252"/>
         <w:ind w:left="2268" w:right="0" w:firstLine="0"/>
         <w:jc w:val="both"/>
       </w:pPr>
@@ -3500,30 +3583,22 @@
         </w:rPr>
         <w:t>4. A privação prolongada de bens essenciais, especialmente refrigerador, aliada à ineficiência do pós-venda e à indevida inscrição do nome da autora em cadastro de inadimplentes, configura situação que extrapola o mero aborrecimento, caracterizando dano moral indenizável.5. O valor inicialmente arbitrado mostrou-se insuficiente diante das peculiaridades do caso, sendo cabível a majoração da indenização para R$ 5.000,00, em observância aos princípios da razoabilidade e proporcionalidade e ao critério bifásico adotado pela jurisprudência. (...)</w:t>
       </w:r>
-    </w:p>
-    <w:p>
-      <w:pPr>
-        <w:keepNext w:val="0"/>
-        <w:widowControl/>
-        <w:spacing w:before="0" w:after="240" w:lineRule="auto" w:line="240"/>
-        <w:ind w:left="2268" w:right="0" w:firstLine="0"/>
-        <w:jc w:val="right"/>
-      </w:pPr>
-      <w:r>
-        <w:rPr>
-          <w:rFonts w:ascii="Arial Narrow" w:hAnsi="Arial Narrow" w:eastAsia="Arial Narrow" w:cs="Arial Narrow"/>
-          <w:b w:val="0"/>
-          <w:i w:val="0"/>
-          <w:color w:val="595959"/>
-          <w:sz w:val="20"/>
-        </w:rPr>
-        <w:t>(TJPR - 9ª Câmara Cível - 0001926-59.2022.8.16.0087 - Guaraniaçu - Rel.: SUBSTITUTO GUILHERME FREDERICO HERNANDES DENZ - J. 15.06.2026)</w:t>
-      </w:r>
-    </w:p>
-    <w:p>
-      <w:pPr>
-        <w:keepNext w:val="0"/>
-        <w:widowControl/>
+      <w:r>
+        <w:rPr>
+          <w:rFonts w:ascii="Arial Narrow" w:hAnsi="Arial Narrow" w:eastAsia="Arial Narrow" w:cs="Arial Narrow"/>
+          <w:b w:val="0"/>
+          <w:i/>
+          <w:color w:val="333333"/>
+          <w:sz w:val="22"/>
+        </w:rPr>
+        <w:t xml:space="preserve"> (TJPR - 9ª Câmara Cível - 0001926-59.2022.8.16.0087 - Guaraniaçu - Rel.: SUBSTITUTO GUILHERME FREDERICO HERNANDES DENZ - J. 15.06.2026)</w:t>
+      </w:r>
+    </w:p>
+    <w:p>
+      <w:pPr>
+        <w:keepNext w:val="0"/>
+        <w:widowControl/>
+        <w:suppressAutoHyphens/>
         <w:spacing w:before="0" w:after="120" w:lineRule="auto" w:line="312"/>
         <w:ind w:left="0" w:right="0" w:firstLine="1417"/>
         <w:jc w:val="both"/>
@@ -3543,6 +3618,7 @@
       <w:pPr>
         <w:keepNext w:val="0"/>
         <w:widowControl/>
+        <w:suppressAutoHyphens/>
         <w:spacing w:before="0" w:after="120" w:lineRule="auto" w:line="312"/>
         <w:ind w:left="0" w:right="0" w:firstLine="1417"/>
         <w:jc w:val="both"/>
@@ -3565,7 +3641,8 @@
         <w:pBdr>
           <w:left w:val="single" w:sz="12" w:space="8" w:color="B4C0D3"/>
         </w:pBdr>
-        <w:spacing w:before="0" w:after="120" w:lineRule="auto" w:line="252"/>
+        <w:suppressAutoHyphens/>
+        <w:spacing w:before="0" w:after="240" w:lineRule="auto" w:line="252"/>
         <w:ind w:left="2268" w:right="0" w:firstLine="0"/>
         <w:jc w:val="both"/>
       </w:pPr>
@@ -3579,30 +3656,22 @@
         </w:rPr>
         <w:t>APELAÇÃO CÍVEL. AÇÃO DE OBRIGAÇÃO DE FAZER C/C REPARAÇÃO POR DANOS MORAIS. AQUISIÇÃO DE MÁQUINA DE LAVAR E SECAR ROUPAS. ENTREGA DE PRODUTO DIVERSO. DEMORA NA REALIZAÇÃO DA TROCA. SENTENÇA DE PROCEDÊNCIA. INSURGÊNCIA DA AUTORA. PRETENSÃO DE MAJORAÇÃO DOS DANOS MORAIS. ESPECIFICIDADES DO CASO CONCRETO NÃO PONDERADAS. TENTATIVAS FRUSTRADAS DE RESOLUÇÃO EXTRAJUDICIAL. PROCRASTINAÇÃO E DESCASO DA RÉ EVIDENTES. DESVIO PRODUTIVO CARACTERIZADO. DEMORA DE UM ANO E MEIO ATÉ A OBTENÇÃO DO PRODUTO CORRETO, POR MANDADO DE BUSCA. IMPOSSIBILIDADE DE USO DE ELETRODOMÉSTICO ESSENCIAL. DUPLA FUNÇÃO DA CONDENAÇÃO. MAJORAÇÃO CONCEDIDA. (...)</w:t>
       </w:r>
-    </w:p>
-    <w:p>
-      <w:pPr>
-        <w:keepNext w:val="0"/>
-        <w:widowControl/>
-        <w:spacing w:before="0" w:after="240" w:lineRule="auto" w:line="240"/>
-        <w:ind w:left="2268" w:right="0" w:firstLine="0"/>
-        <w:jc w:val="right"/>
-      </w:pPr>
-      <w:r>
-        <w:rPr>
-          <w:rFonts w:ascii="Arial Narrow" w:hAnsi="Arial Narrow" w:eastAsia="Arial Narrow" w:cs="Arial Narrow"/>
-          <w:b w:val="0"/>
-          <w:i w:val="0"/>
-          <w:color w:val="595959"/>
-          <w:sz w:val="20"/>
-        </w:rPr>
-        <w:t>(TJPR - 7ª Câmara Cível - 0005103-95.2022.8.16.0001 - Curitiba - Rel.: DESEMBARGADOR VICTOR MARTIM BATSCHKE - J. 28.02.2025)</w:t>
-      </w:r>
-    </w:p>
-    <w:p>
-      <w:pPr>
-        <w:keepNext w:val="0"/>
-        <w:widowControl/>
+      <w:r>
+        <w:rPr>
+          <w:rFonts w:ascii="Arial Narrow" w:hAnsi="Arial Narrow" w:eastAsia="Arial Narrow" w:cs="Arial Narrow"/>
+          <w:b w:val="0"/>
+          <w:i/>
+          <w:color w:val="333333"/>
+          <w:sz w:val="22"/>
+        </w:rPr>
+        <w:t xml:space="preserve"> (TJPR - 7ª Câmara Cível - 0005103-95.2022.8.16.0001 - Curitiba - Rel.: DESEMBARGADOR VICTOR MARTIM BATSCHKE - J. 28.02.2025)</w:t>
+      </w:r>
+    </w:p>
+    <w:p>
+      <w:pPr>
+        <w:keepNext w:val="0"/>
+        <w:widowControl/>
+        <w:suppressAutoHyphens/>
         <w:spacing w:before="0" w:after="120" w:lineRule="auto" w:line="312"/>
         <w:ind w:left="0" w:right="0" w:firstLine="1417"/>
         <w:jc w:val="both"/>
@@ -3622,6 +3691,7 @@
       <w:pPr>
         <w:keepNext w:val="0"/>
         <w:widowControl/>
+        <w:suppressAutoHyphens/>
         <w:spacing w:before="0" w:after="120" w:lineRule="auto" w:line="312"/>
         <w:ind w:left="0" w:right="0" w:firstLine="1417"/>
         <w:jc w:val="both"/>
@@ -3641,6 +3711,7 @@
       <w:pPr>
         <w:keepNext w:val="0"/>
         <w:widowControl/>
+        <w:suppressAutoHyphens/>
         <w:spacing w:before="0" w:after="120" w:lineRule="auto" w:line="312"/>
         <w:ind w:left="0" w:right="0" w:firstLine="1417"/>
         <w:jc w:val="both"/>
@@ -3663,6 +3734,7 @@
         <w:pBdr>
           <w:bottom w:val="single" w:sz="8" w:space="3" w:color="1F3864"/>
         </w:pBdr>
+        <w:suppressAutoHyphens/>
         <w:spacing w:before="280" w:after="120" w:lineRule="auto" w:line="276"/>
         <w:ind w:left="0" w:right="0" w:firstLine="0"/>
         <w:jc w:val="left"/>
@@ -3689,6 +3761,7 @@
           <w:right w:val="single" w:sz="4" w:space="6" w:color="C9D3E3"/>
         </w:pBdr>
         <w:shd w:val="clear" w:color="auto" w:fill="EEF2F7"/>
+        <w:suppressAutoHyphens/>
         <w:spacing w:before="0" w:after="200" w:lineRule="auto" w:line="276"/>
         <w:ind w:left="198" w:right="113" w:firstLine="0"/>
         <w:jc w:val="both"/>
@@ -3718,6 +3791,7 @@
       <w:pPr>
         <w:keepNext w:val="0"/>
         <w:widowControl/>
+        <w:suppressAutoHyphens/>
         <w:spacing w:before="0" w:after="120" w:lineRule="auto" w:line="312"/>
         <w:ind w:left="0" w:right="0" w:firstLine="1417"/>
         <w:jc w:val="both"/>
@@ -3741,6 +3815,7 @@
           <w:left w:val="single" w:sz="24" w:space="6" w:color="1F3864"/>
         </w:pBdr>
         <w:shd w:val="clear" w:color="auto" w:fill="EEF2F7"/>
+        <w:suppressAutoHyphens/>
         <w:spacing w:before="200" w:after="120" w:lineRule="auto" w:line="240"/>
         <w:ind w:left="0" w:right="0" w:firstLine="0"/>
         <w:jc w:val="left"/>
@@ -3763,6 +3838,7 @@
         <w:tabs>
           <w:tab w:pos="567" w:val="left"/>
         </w:tabs>
+        <w:suppressAutoHyphens/>
         <w:spacing w:before="0" w:after="140" w:lineRule="auto" w:line="300"/>
         <w:ind w:left="567" w:right="0" w:hanging="567"/>
         <w:jc w:val="both"/>
@@ -3815,6 +3891,7 @@
         <w:tabs>
           <w:tab w:pos="567" w:val="left"/>
         </w:tabs>
+        <w:suppressAutoHyphens/>
         <w:spacing w:before="0" w:after="140" w:lineRule="auto" w:line="300"/>
         <w:ind w:left="567" w:right="0" w:hanging="567"/>
         <w:jc w:val="both"/>
@@ -3867,6 +3944,7 @@
         <w:tabs>
           <w:tab w:pos="567" w:val="left"/>
         </w:tabs>
+        <w:suppressAutoHyphens/>
         <w:spacing w:before="0" w:after="140" w:lineRule="auto" w:line="300"/>
         <w:ind w:left="567" w:right="0" w:hanging="567"/>
         <w:jc w:val="both"/>
@@ -3919,6 +3997,7 @@
         <w:tabs>
           <w:tab w:pos="567" w:val="left"/>
         </w:tabs>
+        <w:suppressAutoHyphens/>
         <w:spacing w:before="0" w:after="140" w:lineRule="auto" w:line="300"/>
         <w:ind w:left="567" w:right="0" w:hanging="567"/>
         <w:jc w:val="both"/>
@@ -3971,6 +4050,7 @@
         <w:tabs>
           <w:tab w:pos="567" w:val="left"/>
         </w:tabs>
+        <w:suppressAutoHyphens/>
         <w:spacing w:before="0" w:after="140" w:lineRule="auto" w:line="300"/>
         <w:ind w:left="567" w:right="0" w:hanging="567"/>
         <w:jc w:val="both"/>
@@ -4024,6 +4104,7 @@
           <w:left w:val="single" w:sz="24" w:space="6" w:color="1F3864"/>
         </w:pBdr>
         <w:shd w:val="clear" w:color="auto" w:fill="EEF2F7"/>
+        <w:suppressAutoHyphens/>
         <w:spacing w:before="200" w:after="120" w:lineRule="auto" w:line="240"/>
         <w:ind w:left="0" w:right="0" w:firstLine="0"/>
         <w:jc w:val="left"/>
@@ -4043,6 +4124,7 @@
       <w:pPr>
         <w:keepNext w:val="0"/>
         <w:widowControl/>
+        <w:suppressAutoHyphens/>
         <w:spacing w:before="0" w:after="120" w:lineRule="auto" w:line="312"/>
         <w:ind w:left="0" w:right="0" w:firstLine="1417"/>
         <w:jc w:val="both"/>
@@ -4065,6 +4147,7 @@
         <w:tabs>
           <w:tab w:pos="567" w:val="left"/>
         </w:tabs>
+        <w:suppressAutoHyphens/>
         <w:spacing w:before="0" w:after="140" w:lineRule="auto" w:line="300"/>
         <w:ind w:left="567" w:right="0" w:hanging="567"/>
         <w:jc w:val="both"/>
@@ -4117,6 +4200,7 @@
         <w:tabs>
           <w:tab w:pos="567" w:val="left"/>
         </w:tabs>
+        <w:suppressAutoHyphens/>
         <w:spacing w:before="0" w:after="140" w:lineRule="auto" w:line="300"/>
         <w:ind w:left="567" w:right="0" w:hanging="567"/>
         <w:jc w:val="both"/>
@@ -4169,6 +4253,7 @@
         <w:tabs>
           <w:tab w:pos="567" w:val="left"/>
         </w:tabs>
+        <w:suppressAutoHyphens/>
         <w:spacing w:before="0" w:after="140" w:lineRule="auto" w:line="300"/>
         <w:ind w:left="567" w:right="0" w:hanging="567"/>
         <w:jc w:val="both"/>
@@ -4221,6 +4306,7 @@
         <w:tabs>
           <w:tab w:pos="567" w:val="left"/>
         </w:tabs>
+        <w:suppressAutoHyphens/>
         <w:spacing w:before="0" w:after="140" w:lineRule="auto" w:line="300"/>
         <w:ind w:left="567" w:right="0" w:hanging="567"/>
         <w:jc w:val="both"/>
@@ -4274,6 +4360,7 @@
           <w:left w:val="single" w:sz="24" w:space="6" w:color="1F3864"/>
         </w:pBdr>
         <w:shd w:val="clear" w:color="auto" w:fill="EEF2F7"/>
+        <w:suppressAutoHyphens/>
         <w:spacing w:before="200" w:after="120" w:lineRule="auto" w:line="240"/>
         <w:ind w:left="0" w:right="0" w:firstLine="0"/>
         <w:jc w:val="left"/>
@@ -4296,6 +4383,7 @@
         <w:tabs>
           <w:tab w:pos="567" w:val="left"/>
         </w:tabs>
+        <w:suppressAutoHyphens/>
         <w:spacing w:before="0" w:after="140" w:lineRule="auto" w:line="300"/>
         <w:ind w:left="567" w:right="0" w:hanging="567"/>
         <w:jc w:val="both"/>
@@ -4352,6 +4440,7 @@
           <w:right w:val="single" w:sz="4" w:space="6" w:color="C9D3E3"/>
         </w:pBdr>
         <w:shd w:val="clear" w:color="auto" w:fill="EEF2F7"/>
+        <w:suppressAutoHyphens/>
         <w:spacing w:before="240" w:after="240" w:lineRule="auto" w:line="312"/>
         <w:ind w:left="198" w:right="113" w:firstLine="0"/>
         <w:jc w:val="left"/>
@@ -4381,6 +4470,7 @@
       <w:pPr>
         <w:keepNext w:val="0"/>
         <w:widowControl/>
+        <w:suppressAutoHyphens/>
         <w:spacing w:before="200" w:after="0" w:lineRule="auto" w:line="276"/>
         <w:ind w:left="0" w:right="0" w:firstLine="0"/>
         <w:jc w:val="center"/>
@@ -4400,6 +4490,7 @@
       <w:pPr>
         <w:keepNext w:val="0"/>
         <w:widowControl/>
+        <w:suppressAutoHyphens/>
         <w:spacing w:before="0" w:after="200" w:lineRule="auto" w:line="276"/>
         <w:ind w:left="0" w:right="0" w:firstLine="0"/>
         <w:jc w:val="center"/>
@@ -4419,6 +4510,7 @@
       <w:pPr>
         <w:keepNext w:val="0"/>
         <w:widowControl/>
+        <w:suppressAutoHyphens/>
         <w:spacing w:before="0" w:after="600" w:lineRule="auto" w:line="276"/>
         <w:ind w:left="0" w:right="0" w:firstLine="0"/>
         <w:jc w:val="center"/>
@@ -4463,6 +4555,7 @@
               <w:pBdr>
                 <w:top w:val="single" w:sz="6" w:space="4" w:color="595959"/>
               </w:pBdr>
+              <w:suppressAutoHyphens/>
               <w:spacing w:after="0"/>
               <w:ind w:left="454" w:right="454"/>
               <w:jc w:val="center"/>
@@ -4481,6 +4574,7 @@
           </w:p>
           <w:p>
             <w:pPr>
+              <w:suppressAutoHyphens/>
               <w:jc w:val="center"/>
             </w:pPr>
             <w:r>
@@ -4504,6 +4598,7 @@
               <w:pBdr>
                 <w:top w:val="single" w:sz="6" w:space="4" w:color="595959"/>
               </w:pBdr>
+              <w:suppressAutoHyphens/>
               <w:spacing w:after="0"/>
               <w:ind w:left="454" w:right="454"/>
               <w:jc w:val="center"/>
@@ -4522,6 +4617,7 @@
           </w:p>
           <w:p>
             <w:pPr>
+              <w:suppressAutoHyphens/>
               <w:jc w:val="center"/>
             </w:pPr>
             <w:r>
@@ -4577,6 +4673,7 @@
       <w:pBdr>
         <w:bottom w:val="single" w:sz="6" w:space="1" w:color="1F3864"/>
       </w:pBdr>
+      <w:suppressAutoHyphens/>
       <w:spacing w:after="40" w:line="144" w:lineRule="auto"/>
     </w:pPr>
     <w:r>
@@ -4619,6 +4716,7 @@
         </w:tcPr>
         <w:p>
           <w:pPr>
+            <w:suppressAutoHyphens/>
             <w:spacing w:before="0" w:after="0" w:line="264" w:lineRule="auto"/>
             <w:jc w:val="left"/>
           </w:pPr>
@@ -4635,6 +4733,7 @@
         </w:p>
         <w:p>
           <w:pPr>
+            <w:suppressAutoHyphens/>
             <w:spacing w:before="0" w:after="0" w:line="264" w:lineRule="auto"/>
             <w:jc w:val="left"/>
           </w:pPr>
@@ -4651,6 +4750,7 @@
         </w:p>
         <w:p>
           <w:pPr>
+            <w:suppressAutoHyphens/>
             <w:spacing w:before="0" w:after="0" w:line="264" w:lineRule="auto"/>
             <w:jc w:val="left"/>
           </w:pPr>
@@ -4679,6 +4779,7 @@
         </w:tcPr>
         <w:p>
           <w:pPr>
+            <w:suppressAutoHyphens/>
             <w:spacing w:before="0" w:after="0" w:line="264" w:lineRule="auto"/>
             <w:jc w:val="left"/>
           </w:pPr>
@@ -4695,6 +4796,7 @@
         </w:p>
         <w:p>
           <w:pPr>
+            <w:suppressAutoHyphens/>
             <w:spacing w:before="0" w:after="0" w:line="264" w:lineRule="auto"/>
             <w:jc w:val="left"/>
           </w:pPr>
@@ -4723,6 +4825,7 @@
         </w:tcPr>
         <w:p>
           <w:pPr>
+            <w:suppressAutoHyphens/>
             <w:spacing w:before="0" w:after="0" w:line="264" w:lineRule="auto"/>
             <w:jc w:val="left"/>
           </w:pPr>
@@ -4739,6 +4842,7 @@
         </w:p>
         <w:p>
           <w:pPr>
+            <w:suppressAutoHyphens/>
             <w:spacing w:before="0" w:after="0" w:line="264" w:lineRule="auto"/>
             <w:jc w:val="left"/>
           </w:pPr>
@@ -4767,6 +4871,7 @@
         </w:tcPr>
         <w:p>
           <w:pPr>
+            <w:suppressAutoHyphens/>
             <w:spacing w:before="0" w:after="0" w:line="240" w:lineRule="auto"/>
             <w:jc w:val="right"/>
           </w:pPr>
@@ -4896,6 +5001,7 @@
   </w:tbl>
   <w:p>
     <w:pPr>
+      <w:suppressAutoHyphens/>
       <w:spacing w:after="0"/>
     </w:pPr>
   </w:p>
@@ -4954,6 +5060,7 @@
         </w:tcPr>
         <w:p>
           <w:pPr>
+            <w:suppressAutoHyphens/>
             <w:spacing w:before="0" w:after="0" w:line="240" w:lineRule="auto"/>
             <w:jc w:val="left"/>
           </w:pPr>
@@ -5000,6 +5107,7 @@
         </w:tcPr>
         <w:p>
           <w:pPr>
+            <w:suppressAutoHyphens/>
             <w:spacing w:before="0" w:after="0" w:line="276" w:lineRule="auto"/>
           </w:pPr>
           <w:r>
@@ -5015,6 +5123,7 @@
         </w:p>
         <w:p>
           <w:pPr>
+            <w:suppressAutoHyphens/>
             <w:spacing w:before="0" w:after="0" w:line="276" w:lineRule="auto"/>
           </w:pPr>
           <w:r>
@@ -5030,6 +5139,7 @@
         </w:p>
         <w:p>
           <w:pPr>
+            <w:suppressAutoHyphens/>
             <w:spacing w:before="60" w:after="0" w:line="240" w:lineRule="auto"/>
           </w:pPr>
           <w:r>
@@ -5052,6 +5162,7 @@
         </w:tcPr>
         <w:p>
           <w:pPr>
+            <w:suppressAutoHyphens/>
             <w:spacing w:before="0" w:after="0" w:line="276" w:lineRule="auto"/>
             <w:jc w:val="right"/>
           </w:pPr>
@@ -5068,6 +5179,7 @@
         </w:p>
         <w:p>
           <w:pPr>
+            <w:suppressAutoHyphens/>
             <w:spacing w:before="0" w:after="0" w:line="276" w:lineRule="auto"/>
             <w:jc w:val="right"/>
           </w:pPr>
@@ -5090,6 +5202,7 @@
       <w:pBdr>
         <w:top w:val="single" w:sz="12" w:space="1" w:color="1F3864"/>
       </w:pBdr>
+      <w:suppressAutoHyphens/>
       <w:spacing w:before="80" w:after="0" w:line="144" w:lineRule="auto"/>
     </w:pPr>
     <w:r>

</xml_diff>